<commit_message>
se realizaron cambios en el manual y se reemplazo la url, adicional se creo una publicidad para las redes
</commit_message>
<xml_diff>
--- a/MANUAL DE USUARIO OFICIAL SPAN-BUSINESS.docx
+++ b/MANUAL DE USUARIO OFICIAL SPAN-BUSINESS.docx
@@ -214,8 +214,19 @@
           <w:szCs w:val="24"/>
           <w:lang w:val="es-CO"/>
         </w:rPr>
-        <w:t>Haminton Mena Mena</w:t>
-      </w:r>
+        <w:t xml:space="preserve">Haminton Mena </w:t>
+      </w:r>
+      <w:proofErr w:type="spellStart"/>
+      <w:r>
+        <w:rPr>
+          <w:rFonts w:ascii="Comic Sans MS" w:hAnsi="Comic Sans MS"/>
+          <w:sz w:val="24"/>
+          <w:szCs w:val="24"/>
+          <w:lang w:val="es-CO"/>
+        </w:rPr>
+        <w:t>Mena</w:t>
+      </w:r>
+      <w:proofErr w:type="spellEnd"/>
     </w:p>
     <w:p>
       <w:pPr>
@@ -271,16 +282,7 @@
           <w:szCs w:val="24"/>
           <w:lang w:val="es-CO"/>
         </w:rPr>
-        <w:t>Mayo 202</w:t>
-      </w:r>
-      <w:r>
-        <w:rPr>
-          <w:rFonts w:ascii="Comic Sans MS" w:hAnsi="Comic Sans MS"/>
-          <w:sz w:val="24"/>
-          <w:szCs w:val="24"/>
-          <w:lang w:val="es-CO"/>
-        </w:rPr>
-        <w:t>6</w:t>
+        <w:t>Mayo 2026</w:t>
       </w:r>
     </w:p>
     <w:p>
@@ -567,7 +569,14 @@
     <w:sdt>
       <w:sdtPr>
         <w:rPr>
-          <w:lang w:val="es-ES"/>
+          <w:rFonts w:asciiTheme="minorHAnsi" w:eastAsiaTheme="minorHAnsi" w:hAnsiTheme="minorHAnsi" w:cstheme="minorBidi"/>
+          <w:b w:val="0"/>
+          <w:color w:val="auto"/>
+          <w:kern w:val="2"/>
+          <w:sz w:val="22"/>
+          <w:szCs w:val="22"/>
+          <w:lang w:val="es-ES" w:eastAsia="en-US"/>
+          <w14:ligatures w14:val="standardContextual"/>
         </w:rPr>
         <w:id w:val="245074862"/>
         <w:docPartObj>
@@ -577,14 +586,7 @@
       </w:sdtPr>
       <w:sdtEndPr>
         <w:rPr>
-          <w:rFonts w:asciiTheme="minorHAnsi" w:eastAsiaTheme="minorHAnsi" w:hAnsiTheme="minorHAnsi" w:cstheme="minorBidi"/>
-          <w:bCs/>
-          <w:color w:val="auto"/>
-          <w:kern w:val="2"/>
-          <w:sz w:val="22"/>
-          <w:szCs w:val="22"/>
-          <w:lang w:eastAsia="en-US"/>
-          <w14:ligatures w14:val="standardContextual"/>
+          <w:bCs/>
         </w:rPr>
       </w:sdtEndPr>
       <w:sdtContent>
@@ -780,7 +782,7 @@
                 <w:noProof/>
                 <w:webHidden/>
               </w:rPr>
-              <w:t>4</w:t>
+              <w:t>5</w:t>
             </w:r>
             <w:r>
               <w:rPr>
@@ -870,7 +872,7 @@
                 <w:noProof/>
                 <w:webHidden/>
               </w:rPr>
-              <w:t>6</w:t>
+              <w:t>7</w:t>
             </w:r>
             <w:r>
               <w:rPr>
@@ -962,7 +964,7 @@
                 <w:noProof/>
                 <w:webHidden/>
               </w:rPr>
-              <w:t>9</w:t>
+              <w:t>10</w:t>
             </w:r>
             <w:r>
               <w:rPr>
@@ -1054,7 +1056,7 @@
                 <w:noProof/>
                 <w:webHidden/>
               </w:rPr>
-              <w:t>11</w:t>
+              <w:t>12</w:t>
             </w:r>
             <w:r>
               <w:rPr>
@@ -1146,7 +1148,7 @@
                 <w:noProof/>
                 <w:webHidden/>
               </w:rPr>
-              <w:t>13</w:t>
+              <w:t>14</w:t>
             </w:r>
             <w:r>
               <w:rPr>
@@ -1238,7 +1240,7 @@
                 <w:noProof/>
                 <w:webHidden/>
               </w:rPr>
-              <w:t>15</w:t>
+              <w:t>16</w:t>
             </w:r>
             <w:r>
               <w:rPr>
@@ -1330,7 +1332,7 @@
                 <w:noProof/>
                 <w:webHidden/>
               </w:rPr>
-              <w:t>17</w:t>
+              <w:t>18</w:t>
             </w:r>
             <w:r>
               <w:rPr>
@@ -1422,7 +1424,7 @@
                 <w:noProof/>
                 <w:webHidden/>
               </w:rPr>
-              <w:t>19</w:t>
+              <w:t>20</w:t>
             </w:r>
             <w:r>
               <w:rPr>
@@ -1512,7 +1514,7 @@
                 <w:noProof/>
                 <w:webHidden/>
               </w:rPr>
-              <w:t>21</w:t>
+              <w:t>22</w:t>
             </w:r>
             <w:r>
               <w:rPr>
@@ -1602,7 +1604,7 @@
                 <w:noProof/>
                 <w:webHidden/>
               </w:rPr>
-              <w:t>23</w:t>
+              <w:t>24</w:t>
             </w:r>
             <w:r>
               <w:rPr>
@@ -1694,7 +1696,7 @@
                 <w:noProof/>
                 <w:webHidden/>
               </w:rPr>
-              <w:t>25</w:t>
+              <w:t>26</w:t>
             </w:r>
             <w:r>
               <w:rPr>
@@ -1786,7 +1788,7 @@
                 <w:noProof/>
                 <w:webHidden/>
               </w:rPr>
-              <w:t>27</w:t>
+              <w:t>28</w:t>
             </w:r>
             <w:r>
               <w:rPr>
@@ -1878,7 +1880,7 @@
                 <w:noProof/>
                 <w:webHidden/>
               </w:rPr>
-              <w:t>29</w:t>
+              <w:t>30</w:t>
             </w:r>
             <w:r>
               <w:rPr>
@@ -1970,7 +1972,7 @@
                 <w:noProof/>
                 <w:webHidden/>
               </w:rPr>
-              <w:t>31</w:t>
+              <w:t>32</w:t>
             </w:r>
             <w:r>
               <w:rPr>
@@ -2062,7 +2064,7 @@
                 <w:noProof/>
                 <w:webHidden/>
               </w:rPr>
-              <w:t>33</w:t>
+              <w:t>34</w:t>
             </w:r>
             <w:r>
               <w:rPr>
@@ -2154,7 +2156,7 @@
                 <w:noProof/>
                 <w:webHidden/>
               </w:rPr>
-              <w:t>35</w:t>
+              <w:t>36</w:t>
             </w:r>
             <w:r>
               <w:rPr>
@@ -2246,7 +2248,7 @@
                 <w:noProof/>
                 <w:webHidden/>
               </w:rPr>
-              <w:t>37</w:t>
+              <w:t>38</w:t>
             </w:r>
             <w:r>
               <w:rPr>
@@ -2338,7 +2340,7 @@
                 <w:noProof/>
                 <w:webHidden/>
               </w:rPr>
-              <w:t>39</w:t>
+              <w:t>40</w:t>
             </w:r>
             <w:r>
               <w:rPr>
@@ -2430,7 +2432,7 @@
                 <w:noProof/>
                 <w:webHidden/>
               </w:rPr>
-              <w:t>41</w:t>
+              <w:t>42</w:t>
             </w:r>
             <w:r>
               <w:rPr>
@@ -2522,7 +2524,7 @@
                 <w:noProof/>
                 <w:webHidden/>
               </w:rPr>
-              <w:t>43</w:t>
+              <w:t>44</w:t>
             </w:r>
             <w:r>
               <w:rPr>
@@ -2614,7 +2616,7 @@
                 <w:noProof/>
                 <w:webHidden/>
               </w:rPr>
-              <w:t>45</w:t>
+              <w:t>46</w:t>
             </w:r>
             <w:r>
               <w:rPr>
@@ -2706,7 +2708,7 @@
                 <w:noProof/>
                 <w:webHidden/>
               </w:rPr>
-              <w:t>47</w:t>
+              <w:t>48</w:t>
             </w:r>
             <w:r>
               <w:rPr>
@@ -2798,7 +2800,7 @@
                 <w:noProof/>
                 <w:webHidden/>
               </w:rPr>
-              <w:t>49</w:t>
+              <w:t>50</w:t>
             </w:r>
             <w:r>
               <w:rPr>
@@ -2890,7 +2892,7 @@
                 <w:noProof/>
                 <w:webHidden/>
               </w:rPr>
-              <w:t>52</w:t>
+              <w:t>53</w:t>
             </w:r>
             <w:r>
               <w:rPr>
@@ -2982,7 +2984,7 @@
                 <w:noProof/>
                 <w:webHidden/>
               </w:rPr>
-              <w:t>54</w:t>
+              <w:t>55</w:t>
             </w:r>
             <w:r>
               <w:rPr>
@@ -3074,7 +3076,7 @@
                 <w:noProof/>
                 <w:webHidden/>
               </w:rPr>
-              <w:t>56</w:t>
+              <w:t>57</w:t>
             </w:r>
             <w:r>
               <w:rPr>
@@ -3166,7 +3168,7 @@
                 <w:noProof/>
                 <w:webHidden/>
               </w:rPr>
-              <w:t>59</w:t>
+              <w:t>60</w:t>
             </w:r>
             <w:r>
               <w:rPr>
@@ -3258,7 +3260,7 @@
                 <w:noProof/>
                 <w:webHidden/>
               </w:rPr>
-              <w:t>61</w:t>
+              <w:t>62</w:t>
             </w:r>
             <w:r>
               <w:rPr>
@@ -3350,7 +3352,7 @@
                 <w:noProof/>
                 <w:webHidden/>
               </w:rPr>
-              <w:t>62</w:t>
+              <w:t>63</w:t>
             </w:r>
             <w:r>
               <w:rPr>
@@ -3430,13 +3432,31 @@
           <w:szCs w:val="24"/>
           <w:lang w:val="es-CO"/>
         </w:rPr>
-        <w:t xml:space="preserve">¡Bienvenido a </w:t>
-      </w:r>
-      <w:r>
-        <w:rPr>
-          <w:rFonts w:ascii="Comic Sans MS" w:hAnsi="Comic Sans MS"/>
-          <w:b/>
-          <w:bCs/>
+        <w:t>¡Bienvenido a Span-Business!</w:t>
+      </w:r>
+    </w:p>
+    <w:p>
+      <w:pPr>
+        <w:jc w:val="both"/>
+        <w:rPr>
+          <w:rFonts w:ascii="Comic Sans MS" w:hAnsi="Comic Sans MS"/>
+          <w:sz w:val="24"/>
+          <w:szCs w:val="24"/>
+          <w:lang w:val="es-CO"/>
+        </w:rPr>
+      </w:pPr>
+      <w:r>
+        <w:rPr>
+          <w:rFonts w:ascii="Comic Sans MS" w:hAnsi="Comic Sans MS"/>
+          <w:sz w:val="24"/>
+          <w:szCs w:val="24"/>
+          <w:lang w:val="es-CO"/>
+        </w:rPr>
+        <w:t xml:space="preserve">Te damos la bienvenida a </w:t>
+      </w:r>
+      <w:r>
+        <w:rPr>
+          <w:rFonts w:ascii="Comic Sans MS" w:hAnsi="Comic Sans MS"/>
           <w:sz w:val="24"/>
           <w:szCs w:val="24"/>
           <w:lang w:val="es-CO"/>
@@ -3446,46 +3466,6 @@
       <w:r>
         <w:rPr>
           <w:rFonts w:ascii="Comic Sans MS" w:hAnsi="Comic Sans MS"/>
-          <w:b/>
-          <w:bCs/>
-          <w:sz w:val="24"/>
-          <w:szCs w:val="24"/>
-          <w:lang w:val="es-CO"/>
-        </w:rPr>
-        <w:t>!</w:t>
-      </w:r>
-    </w:p>
-    <w:p>
-      <w:pPr>
-        <w:jc w:val="both"/>
-        <w:rPr>
-          <w:rFonts w:ascii="Comic Sans MS" w:hAnsi="Comic Sans MS"/>
-          <w:sz w:val="24"/>
-          <w:szCs w:val="24"/>
-          <w:lang w:val="es-CO"/>
-        </w:rPr>
-      </w:pPr>
-      <w:r>
-        <w:rPr>
-          <w:rFonts w:ascii="Comic Sans MS" w:hAnsi="Comic Sans MS"/>
-          <w:sz w:val="24"/>
-          <w:szCs w:val="24"/>
-          <w:lang w:val="es-CO"/>
-        </w:rPr>
-        <w:t xml:space="preserve">Te damos la bienvenida a </w:t>
-      </w:r>
-      <w:r>
-        <w:rPr>
-          <w:rFonts w:ascii="Comic Sans MS" w:hAnsi="Comic Sans MS"/>
-          <w:sz w:val="24"/>
-          <w:szCs w:val="24"/>
-          <w:lang w:val="es-CO"/>
-        </w:rPr>
-        <w:t>Span-Business</w:t>
-      </w:r>
-      <w:r>
-        <w:rPr>
-          <w:rFonts w:ascii="Comic Sans MS" w:hAnsi="Comic Sans MS"/>
           <w:sz w:val="24"/>
           <w:szCs w:val="24"/>
           <w:lang w:val="es-CO"/>
@@ -3506,6 +3486,57 @@
       <w:r>
         <w:rPr>
           <w:rFonts w:ascii="Comic Sans MS" w:hAnsi="Comic Sans MS"/>
+          <w:b/>
+          <w:bCs/>
+          <w:sz w:val="24"/>
+          <w:szCs w:val="24"/>
+          <w:lang w:val="es-CO"/>
+        </w:rPr>
+        <w:t>SPAN BUSINESS</w:t>
+      </w:r>
+      <w:r>
+        <w:rPr>
+          <w:rFonts w:ascii="Comic Sans MS" w:hAnsi="Comic Sans MS"/>
+          <w:sz w:val="24"/>
+          <w:szCs w:val="24"/>
+          <w:lang w:val="es-CO"/>
+        </w:rPr>
+        <w:t xml:space="preserve"> es un sistema diseñado para optimizar la gestión de información y procesos dentro de una organización, permitiendo centralizar datos, automatizar tareas y mejorar la eficiencia operativa.</w:t>
+      </w:r>
+    </w:p>
+    <w:p>
+      <w:pPr>
+        <w:jc w:val="both"/>
+        <w:rPr>
+          <w:rFonts w:ascii="Comic Sans MS" w:hAnsi="Comic Sans MS"/>
+          <w:sz w:val="24"/>
+          <w:szCs w:val="24"/>
+          <w:lang w:val="es-CO"/>
+        </w:rPr>
+      </w:pPr>
+      <w:r>
+        <w:rPr>
+          <w:rFonts w:ascii="Comic Sans MS" w:hAnsi="Comic Sans MS"/>
+          <w:sz w:val="24"/>
+          <w:szCs w:val="24"/>
+          <w:lang w:val="es-CO"/>
+        </w:rPr>
+        <w:t>Este manual tiene como objetivo guiar al usuario en el uso correcto del sistema, desde el acceso inicial hasta la ejecución de sus principales funcionalidades.</w:t>
+      </w:r>
+    </w:p>
+    <w:p>
+      <w:pPr>
+        <w:jc w:val="both"/>
+        <w:rPr>
+          <w:rFonts w:ascii="Comic Sans MS" w:hAnsi="Comic Sans MS"/>
+          <w:sz w:val="24"/>
+          <w:szCs w:val="24"/>
+          <w:lang w:val="es-CO"/>
+        </w:rPr>
+      </w:pPr>
+      <w:r>
+        <w:rPr>
+          <w:rFonts w:ascii="Comic Sans MS" w:hAnsi="Comic Sans MS"/>
           <w:sz w:val="24"/>
           <w:szCs w:val="24"/>
           <w:lang w:val="es-CO"/>
@@ -3543,6 +3574,544 @@
       </w:pPr>
       <w:r>
         <w:rPr>
+          <w:rFonts w:ascii="Segoe UI Emoji" w:hAnsi="Segoe UI Emoji" w:cs="Segoe UI Emoji"/>
+          <w:b/>
+          <w:bCs/>
+          <w:sz w:val="24"/>
+          <w:szCs w:val="24"/>
+          <w:lang w:val="es-CO"/>
+        </w:rPr>
+        <w:t>🎯</w:t>
+      </w:r>
+      <w:r>
+        <w:rPr>
+          <w:rFonts w:ascii="Comic Sans MS" w:hAnsi="Comic Sans MS"/>
+          <w:b/>
+          <w:bCs/>
+          <w:sz w:val="24"/>
+          <w:szCs w:val="24"/>
+          <w:lang w:val="es-CO"/>
+        </w:rPr>
+        <w:t xml:space="preserve"> ¿Para quién es este sistema?</w:t>
+      </w:r>
+    </w:p>
+    <w:p>
+      <w:pPr>
+        <w:jc w:val="both"/>
+        <w:rPr>
+          <w:rFonts w:ascii="Comic Sans MS" w:hAnsi="Comic Sans MS"/>
+          <w:sz w:val="24"/>
+          <w:szCs w:val="24"/>
+          <w:lang w:val="es-CO"/>
+        </w:rPr>
+      </w:pPr>
+      <w:r>
+        <w:rPr>
+          <w:rFonts w:ascii="Comic Sans MS" w:hAnsi="Comic Sans MS"/>
+          <w:b/>
+          <w:bCs/>
+          <w:sz w:val="24"/>
+          <w:szCs w:val="24"/>
+          <w:lang w:val="es-CO"/>
+        </w:rPr>
+        <w:t>SPAN BUSINESS</w:t>
+      </w:r>
+      <w:r>
+        <w:rPr>
+          <w:rFonts w:ascii="Comic Sans MS" w:hAnsi="Comic Sans MS"/>
+          <w:sz w:val="24"/>
+          <w:szCs w:val="24"/>
+          <w:lang w:val="es-CO"/>
+        </w:rPr>
+        <w:t xml:space="preserve"> está dirigido a:</w:t>
+      </w:r>
+    </w:p>
+    <w:p>
+      <w:pPr>
+        <w:numPr>
+          <w:ilvl w:val="0"/>
+          <w:numId w:val="62"/>
+        </w:numPr>
+        <w:jc w:val="both"/>
+        <w:rPr>
+          <w:rFonts w:ascii="Comic Sans MS" w:hAnsi="Comic Sans MS"/>
+          <w:sz w:val="24"/>
+          <w:szCs w:val="24"/>
+          <w:lang w:val="es-CO"/>
+        </w:rPr>
+      </w:pPr>
+      <w:r>
+        <w:rPr>
+          <w:rFonts w:ascii="Comic Sans MS" w:hAnsi="Comic Sans MS"/>
+          <w:sz w:val="24"/>
+          <w:szCs w:val="24"/>
+          <w:lang w:val="es-CO"/>
+        </w:rPr>
+        <w:t xml:space="preserve">Empresas que necesitan organizar su información </w:t>
+      </w:r>
+    </w:p>
+    <w:p>
+      <w:pPr>
+        <w:numPr>
+          <w:ilvl w:val="0"/>
+          <w:numId w:val="62"/>
+        </w:numPr>
+        <w:jc w:val="both"/>
+        <w:rPr>
+          <w:rFonts w:ascii="Comic Sans MS" w:hAnsi="Comic Sans MS"/>
+          <w:sz w:val="24"/>
+          <w:szCs w:val="24"/>
+          <w:lang w:val="es-CO"/>
+        </w:rPr>
+      </w:pPr>
+      <w:r>
+        <w:rPr>
+          <w:rFonts w:ascii="Comic Sans MS" w:hAnsi="Comic Sans MS"/>
+          <w:sz w:val="24"/>
+          <w:szCs w:val="24"/>
+          <w:lang w:val="es-CO"/>
+        </w:rPr>
+        <w:t xml:space="preserve">Administradores de sistemas </w:t>
+      </w:r>
+    </w:p>
+    <w:p>
+      <w:pPr>
+        <w:numPr>
+          <w:ilvl w:val="0"/>
+          <w:numId w:val="62"/>
+        </w:numPr>
+        <w:jc w:val="both"/>
+        <w:rPr>
+          <w:rFonts w:ascii="Comic Sans MS" w:hAnsi="Comic Sans MS"/>
+          <w:sz w:val="24"/>
+          <w:szCs w:val="24"/>
+          <w:lang w:val="es-CO"/>
+        </w:rPr>
+      </w:pPr>
+      <w:r>
+        <w:rPr>
+          <w:rFonts w:ascii="Comic Sans MS" w:hAnsi="Comic Sans MS"/>
+          <w:sz w:val="24"/>
+          <w:szCs w:val="24"/>
+          <w:lang w:val="es-CO"/>
+        </w:rPr>
+        <w:t xml:space="preserve">Usuarios operativos que gestionan datos </w:t>
+      </w:r>
+    </w:p>
+    <w:p>
+      <w:pPr>
+        <w:numPr>
+          <w:ilvl w:val="0"/>
+          <w:numId w:val="62"/>
+        </w:numPr>
+        <w:jc w:val="both"/>
+        <w:rPr>
+          <w:rFonts w:ascii="Comic Sans MS" w:hAnsi="Comic Sans MS"/>
+          <w:sz w:val="24"/>
+          <w:szCs w:val="24"/>
+          <w:lang w:val="es-CO"/>
+        </w:rPr>
+      </w:pPr>
+      <w:r>
+        <w:rPr>
+          <w:rFonts w:ascii="Comic Sans MS" w:hAnsi="Comic Sans MS"/>
+          <w:sz w:val="24"/>
+          <w:szCs w:val="24"/>
+          <w:lang w:val="es-CO"/>
+        </w:rPr>
+        <w:t>Equipos que buscan optimizar procesos internos</w:t>
+      </w:r>
+    </w:p>
+    <w:p>
+      <w:pPr>
+        <w:jc w:val="both"/>
+        <w:rPr>
+          <w:rFonts w:ascii="Comic Sans MS" w:hAnsi="Comic Sans MS"/>
+          <w:sz w:val="24"/>
+          <w:szCs w:val="24"/>
+          <w:lang w:val="es-CO"/>
+        </w:rPr>
+      </w:pPr>
+    </w:p>
+    <w:p>
+      <w:pPr>
+        <w:pStyle w:val="Prrafodelista"/>
+        <w:numPr>
+          <w:ilvl w:val="0"/>
+          <w:numId w:val="59"/>
+        </w:numPr>
+        <w:jc w:val="both"/>
+        <w:rPr>
+          <w:rFonts w:ascii="Comic Sans MS" w:hAnsi="Comic Sans MS"/>
+          <w:b/>
+          <w:bCs/>
+          <w:sz w:val="24"/>
+          <w:szCs w:val="24"/>
+          <w:lang w:val="es-CO"/>
+        </w:rPr>
+      </w:pPr>
+      <w:r>
+        <w:rPr>
+          <w:rFonts w:ascii="Segoe UI Emoji" w:hAnsi="Segoe UI Emoji" w:cs="Segoe UI Emoji"/>
+          <w:b/>
+          <w:bCs/>
+          <w:sz w:val="24"/>
+          <w:szCs w:val="24"/>
+          <w:lang w:val="es-CO"/>
+        </w:rPr>
+        <w:t>🚀</w:t>
+      </w:r>
+      <w:r>
+        <w:rPr>
+          <w:rFonts w:ascii="Comic Sans MS" w:hAnsi="Comic Sans MS"/>
+          <w:b/>
+          <w:bCs/>
+          <w:sz w:val="24"/>
+          <w:szCs w:val="24"/>
+          <w:lang w:val="es-CO"/>
+        </w:rPr>
+        <w:t xml:space="preserve"> Beneficios principales</w:t>
+      </w:r>
+    </w:p>
+    <w:p>
+      <w:pPr>
+        <w:numPr>
+          <w:ilvl w:val="0"/>
+          <w:numId w:val="63"/>
+        </w:numPr>
+        <w:jc w:val="both"/>
+        <w:rPr>
+          <w:rFonts w:ascii="Comic Sans MS" w:hAnsi="Comic Sans MS"/>
+          <w:sz w:val="24"/>
+          <w:szCs w:val="24"/>
+          <w:lang w:val="es-CO"/>
+        </w:rPr>
+      </w:pPr>
+      <w:r>
+        <w:rPr>
+          <w:rFonts w:ascii="Segoe UI Emoji" w:hAnsi="Segoe UI Emoji" w:cs="Segoe UI Emoji"/>
+          <w:sz w:val="24"/>
+          <w:szCs w:val="24"/>
+          <w:lang w:val="es-CO"/>
+        </w:rPr>
+        <w:t>✔️</w:t>
+      </w:r>
+      <w:r>
+        <w:rPr>
+          <w:rFonts w:ascii="Comic Sans MS" w:hAnsi="Comic Sans MS"/>
+          <w:sz w:val="24"/>
+          <w:szCs w:val="24"/>
+          <w:lang w:val="es-CO"/>
+        </w:rPr>
+        <w:t xml:space="preserve"> Centralización de la información </w:t>
+      </w:r>
+    </w:p>
+    <w:p>
+      <w:pPr>
+        <w:numPr>
+          <w:ilvl w:val="0"/>
+          <w:numId w:val="63"/>
+        </w:numPr>
+        <w:jc w:val="both"/>
+        <w:rPr>
+          <w:rFonts w:ascii="Comic Sans MS" w:hAnsi="Comic Sans MS"/>
+          <w:sz w:val="24"/>
+          <w:szCs w:val="24"/>
+          <w:lang w:val="es-CO"/>
+        </w:rPr>
+      </w:pPr>
+      <w:r>
+        <w:rPr>
+          <w:rFonts w:ascii="Segoe UI Emoji" w:hAnsi="Segoe UI Emoji" w:cs="Segoe UI Emoji"/>
+          <w:sz w:val="24"/>
+          <w:szCs w:val="24"/>
+          <w:lang w:val="es-CO"/>
+        </w:rPr>
+        <w:t>✔️</w:t>
+      </w:r>
+      <w:r>
+        <w:rPr>
+          <w:rFonts w:ascii="Comic Sans MS" w:hAnsi="Comic Sans MS"/>
+          <w:sz w:val="24"/>
+          <w:szCs w:val="24"/>
+          <w:lang w:val="es-CO"/>
+        </w:rPr>
+        <w:t xml:space="preserve"> Reducción de procesos manuales </w:t>
+      </w:r>
+    </w:p>
+    <w:p>
+      <w:pPr>
+        <w:numPr>
+          <w:ilvl w:val="0"/>
+          <w:numId w:val="63"/>
+        </w:numPr>
+        <w:jc w:val="both"/>
+        <w:rPr>
+          <w:rFonts w:ascii="Comic Sans MS" w:hAnsi="Comic Sans MS"/>
+          <w:sz w:val="24"/>
+          <w:szCs w:val="24"/>
+          <w:lang w:val="es-CO"/>
+        </w:rPr>
+      </w:pPr>
+      <w:r>
+        <w:rPr>
+          <w:rFonts w:ascii="Segoe UI Emoji" w:hAnsi="Segoe UI Emoji" w:cs="Segoe UI Emoji"/>
+          <w:sz w:val="24"/>
+          <w:szCs w:val="24"/>
+          <w:lang w:val="es-CO"/>
+        </w:rPr>
+        <w:lastRenderedPageBreak/>
+        <w:t>✔️</w:t>
+      </w:r>
+      <w:r>
+        <w:rPr>
+          <w:rFonts w:ascii="Comic Sans MS" w:hAnsi="Comic Sans MS"/>
+          <w:sz w:val="24"/>
+          <w:szCs w:val="24"/>
+          <w:lang w:val="es-CO"/>
+        </w:rPr>
+        <w:t xml:space="preserve"> Mayor control y trazabilidad </w:t>
+      </w:r>
+    </w:p>
+    <w:p>
+      <w:pPr>
+        <w:numPr>
+          <w:ilvl w:val="0"/>
+          <w:numId w:val="63"/>
+        </w:numPr>
+        <w:jc w:val="both"/>
+        <w:rPr>
+          <w:rFonts w:ascii="Comic Sans MS" w:hAnsi="Comic Sans MS"/>
+          <w:sz w:val="24"/>
+          <w:szCs w:val="24"/>
+          <w:lang w:val="es-CO"/>
+        </w:rPr>
+      </w:pPr>
+      <w:r>
+        <w:rPr>
+          <w:rFonts w:ascii="Segoe UI Emoji" w:hAnsi="Segoe UI Emoji" w:cs="Segoe UI Emoji"/>
+          <w:sz w:val="24"/>
+          <w:szCs w:val="24"/>
+          <w:lang w:val="es-CO"/>
+        </w:rPr>
+        <w:t>✔️</w:t>
+      </w:r>
+      <w:r>
+        <w:rPr>
+          <w:rFonts w:ascii="Comic Sans MS" w:hAnsi="Comic Sans MS"/>
+          <w:sz w:val="24"/>
+          <w:szCs w:val="24"/>
+          <w:lang w:val="es-CO"/>
+        </w:rPr>
+        <w:t xml:space="preserve"> Acceso rápido y seguro a los datos </w:t>
+      </w:r>
+    </w:p>
+    <w:p>
+      <w:pPr>
+        <w:numPr>
+          <w:ilvl w:val="0"/>
+          <w:numId w:val="63"/>
+        </w:numPr>
+        <w:jc w:val="both"/>
+        <w:rPr>
+          <w:rFonts w:ascii="Comic Sans MS" w:hAnsi="Comic Sans MS"/>
+          <w:sz w:val="24"/>
+          <w:szCs w:val="24"/>
+          <w:lang w:val="es-CO"/>
+        </w:rPr>
+      </w:pPr>
+      <w:r>
+        <w:rPr>
+          <w:rFonts w:ascii="Segoe UI Emoji" w:hAnsi="Segoe UI Emoji" w:cs="Segoe UI Emoji"/>
+          <w:sz w:val="24"/>
+          <w:szCs w:val="24"/>
+          <w:lang w:val="es-CO"/>
+        </w:rPr>
+        <w:t>✔️</w:t>
+      </w:r>
+      <w:r>
+        <w:rPr>
+          <w:rFonts w:ascii="Comic Sans MS" w:hAnsi="Comic Sans MS"/>
+          <w:sz w:val="24"/>
+          <w:szCs w:val="24"/>
+          <w:lang w:val="es-CO"/>
+        </w:rPr>
+        <w:t xml:space="preserve"> Mejora en la toma de decisiones</w:t>
+      </w:r>
+    </w:p>
+    <w:p>
+      <w:pPr>
+        <w:jc w:val="both"/>
+        <w:rPr>
+          <w:rFonts w:ascii="Comic Sans MS" w:hAnsi="Comic Sans MS"/>
+          <w:sz w:val="24"/>
+          <w:szCs w:val="24"/>
+          <w:lang w:val="es-CO"/>
+        </w:rPr>
+      </w:pPr>
+    </w:p>
+    <w:p>
+      <w:pPr>
+        <w:pStyle w:val="Prrafodelista"/>
+        <w:numPr>
+          <w:ilvl w:val="0"/>
+          <w:numId w:val="59"/>
+        </w:numPr>
+        <w:jc w:val="both"/>
+        <w:rPr>
+          <w:rFonts w:ascii="Comic Sans MS" w:hAnsi="Comic Sans MS"/>
+          <w:b/>
+          <w:bCs/>
+          <w:sz w:val="24"/>
+          <w:szCs w:val="24"/>
+          <w:lang w:val="es-CO"/>
+        </w:rPr>
+      </w:pPr>
+      <w:r>
+        <w:rPr>
+          <w:rFonts w:ascii="Segoe UI Emoji" w:hAnsi="Segoe UI Emoji" w:cs="Segoe UI Emoji"/>
+          <w:b/>
+          <w:bCs/>
+          <w:sz w:val="24"/>
+          <w:szCs w:val="24"/>
+          <w:lang w:val="es-CO"/>
+        </w:rPr>
+        <w:t>⚙️</w:t>
+      </w:r>
+      <w:r>
+        <w:rPr>
+          <w:rFonts w:ascii="Comic Sans MS" w:hAnsi="Comic Sans MS"/>
+          <w:b/>
+          <w:bCs/>
+          <w:sz w:val="24"/>
+          <w:szCs w:val="24"/>
+          <w:lang w:val="es-CO"/>
+        </w:rPr>
+        <w:t xml:space="preserve"> Requisitos del sistema</w:t>
+      </w:r>
+    </w:p>
+    <w:p>
+      <w:pPr>
+        <w:jc w:val="both"/>
+        <w:rPr>
+          <w:rFonts w:ascii="Comic Sans MS" w:hAnsi="Comic Sans MS"/>
+          <w:sz w:val="24"/>
+          <w:szCs w:val="24"/>
+          <w:lang w:val="es-CO"/>
+        </w:rPr>
+      </w:pPr>
+      <w:r>
+        <w:rPr>
+          <w:rFonts w:ascii="Comic Sans MS" w:hAnsi="Comic Sans MS"/>
+          <w:sz w:val="24"/>
+          <w:szCs w:val="24"/>
+          <w:lang w:val="es-CO"/>
+        </w:rPr>
+        <w:t>Para utilizar SPAN BUSINESS se requiere:</w:t>
+      </w:r>
+    </w:p>
+    <w:p>
+      <w:pPr>
+        <w:numPr>
+          <w:ilvl w:val="0"/>
+          <w:numId w:val="64"/>
+        </w:numPr>
+        <w:jc w:val="both"/>
+        <w:rPr>
+          <w:rFonts w:ascii="Comic Sans MS" w:hAnsi="Comic Sans MS"/>
+          <w:sz w:val="24"/>
+          <w:szCs w:val="24"/>
+          <w:lang w:val="pt-PT"/>
+        </w:rPr>
+      </w:pPr>
+      <w:r>
+        <w:rPr>
+          <w:rFonts w:ascii="Comic Sans MS" w:hAnsi="Comic Sans MS"/>
+          <w:sz w:val="24"/>
+          <w:szCs w:val="24"/>
+          <w:lang w:val="pt-PT"/>
+        </w:rPr>
+        <w:t xml:space="preserve">Navegador web actualizado (Chrome, Edge, Firefox) </w:t>
+      </w:r>
+    </w:p>
+    <w:p>
+      <w:pPr>
+        <w:numPr>
+          <w:ilvl w:val="0"/>
+          <w:numId w:val="64"/>
+        </w:numPr>
+        <w:jc w:val="both"/>
+        <w:rPr>
+          <w:rFonts w:ascii="Comic Sans MS" w:hAnsi="Comic Sans MS"/>
+          <w:sz w:val="24"/>
+          <w:szCs w:val="24"/>
+          <w:lang w:val="es-CO"/>
+        </w:rPr>
+      </w:pPr>
+      <w:r>
+        <w:rPr>
+          <w:rFonts w:ascii="Comic Sans MS" w:hAnsi="Comic Sans MS"/>
+          <w:sz w:val="24"/>
+          <w:szCs w:val="24"/>
+          <w:lang w:val="es-CO"/>
+        </w:rPr>
+        <w:t xml:space="preserve">Conexión a internet estable </w:t>
+      </w:r>
+    </w:p>
+    <w:p>
+      <w:pPr>
+        <w:numPr>
+          <w:ilvl w:val="0"/>
+          <w:numId w:val="64"/>
+        </w:numPr>
+        <w:jc w:val="both"/>
+        <w:rPr>
+          <w:rFonts w:ascii="Comic Sans MS" w:hAnsi="Comic Sans MS"/>
+          <w:sz w:val="24"/>
+          <w:szCs w:val="24"/>
+          <w:lang w:val="es-CO"/>
+        </w:rPr>
+      </w:pPr>
+      <w:r>
+        <w:rPr>
+          <w:rFonts w:ascii="Comic Sans MS" w:hAnsi="Comic Sans MS"/>
+          <w:sz w:val="24"/>
+          <w:szCs w:val="24"/>
+          <w:lang w:val="es-CO"/>
+        </w:rPr>
+        <w:t>Credenciales de acceso (usuario y contraseña)</w:t>
+      </w:r>
+    </w:p>
+    <w:p>
+      <w:pPr>
+        <w:jc w:val="both"/>
+        <w:rPr>
+          <w:rFonts w:ascii="Comic Sans MS" w:hAnsi="Comic Sans MS"/>
+          <w:sz w:val="24"/>
+          <w:szCs w:val="24"/>
+          <w:lang w:val="es-CO"/>
+        </w:rPr>
+      </w:pPr>
+    </w:p>
+    <w:p>
+      <w:pPr>
+        <w:pStyle w:val="Prrafodelista"/>
+        <w:numPr>
+          <w:ilvl w:val="0"/>
+          <w:numId w:val="59"/>
+        </w:numPr>
+        <w:jc w:val="both"/>
+        <w:rPr>
+          <w:rFonts w:ascii="Comic Sans MS" w:hAnsi="Comic Sans MS"/>
+          <w:b/>
+          <w:bCs/>
+          <w:sz w:val="24"/>
+          <w:szCs w:val="24"/>
+          <w:lang w:val="es-CO"/>
+        </w:rPr>
+      </w:pPr>
+      <w:r>
+        <w:rPr>
           <w:rFonts w:ascii="Comic Sans MS" w:hAnsi="Comic Sans MS"/>
           <w:b/>
           <w:bCs/>
@@ -3727,7 +4296,27 @@
           <w:szCs w:val="24"/>
           <w:lang w:val="es-CO"/>
         </w:rPr>
-        <w:t>Una computadora, tablet o teléfono celular inteligente.</w:t>
+        <w:t xml:space="preserve">Una computadora, </w:t>
+      </w:r>
+      <w:proofErr w:type="spellStart"/>
+      <w:r>
+        <w:rPr>
+          <w:rFonts w:ascii="Comic Sans MS" w:hAnsi="Comic Sans MS"/>
+          <w:sz w:val="24"/>
+          <w:szCs w:val="24"/>
+          <w:lang w:val="es-CO"/>
+        </w:rPr>
+        <w:t>tablet</w:t>
+      </w:r>
+      <w:proofErr w:type="spellEnd"/>
+      <w:r>
+        <w:rPr>
+          <w:rFonts w:ascii="Comic Sans MS" w:hAnsi="Comic Sans MS"/>
+          <w:sz w:val="24"/>
+          <w:szCs w:val="24"/>
+          <w:lang w:val="es-CO"/>
+        </w:rPr>
+        <w:t xml:space="preserve"> o teléfono celular inteligente.</w:t>
       </w:r>
     </w:p>
     <w:p>
@@ -3883,11 +4472,19 @@
         </w:rPr>
       </w:pPr>
       <w:bookmarkStart w:id="1" w:name="_Toc228882850"/>
-      <w:r>
-        <w:rPr>
-          <w:lang w:val="es-CO"/>
-        </w:rPr>
-        <w:t>Dashboard Administrativo</w:t>
+      <w:proofErr w:type="spellStart"/>
+      <w:r>
+        <w:rPr>
+          <w:lang w:val="es-CO"/>
+        </w:rPr>
+        <w:t>Dashboard</w:t>
+      </w:r>
+      <w:proofErr w:type="spellEnd"/>
+      <w:r>
+        <w:rPr>
+          <w:lang w:val="es-CO"/>
+        </w:rPr>
+        <w:t xml:space="preserve"> Administrativo</w:t>
       </w:r>
       <w:bookmarkEnd w:id="1"/>
     </w:p>
@@ -3915,7 +4512,7 @@
           <w:noProof/>
         </w:rPr>
         <w:drawing>
-          <wp:inline distT="0" distB="0" distL="0" distR="0" wp14:anchorId="1D185F63" wp14:editId="357D351B">
+          <wp:inline distT="0" distB="0" distL="0" distR="0" wp14:anchorId="1D185F63" wp14:editId="4B81FB5A">
             <wp:extent cx="5612130" cy="3689350"/>
             <wp:effectExtent l="0" t="0" r="7620" b="6350"/>
             <wp:docPr id="646336475" name="Imagen 22" descr="Click on Comunicado Importante…"/>
@@ -4382,16 +4979,69 @@
           <w:szCs w:val="24"/>
           <w:lang w:val="es-CO"/>
         </w:rPr>
-        <w:t>Acceder al dashboard</w:t>
-      </w:r>
-      <w:r>
-        <w:rPr>
-          <w:rFonts w:ascii="Comic Sans MS" w:hAnsi="Comic Sans MS"/>
-          <w:sz w:val="24"/>
-          <w:szCs w:val="24"/>
-          <w:lang w:val="es-CO"/>
-        </w:rPr>
-        <w:t>: Iniciar sesión como administrador y seleccionar "Dashboard Admin"</w:t>
+        <w:t xml:space="preserve">Acceder al </w:t>
+      </w:r>
+      <w:proofErr w:type="spellStart"/>
+      <w:r>
+        <w:rPr>
+          <w:rFonts w:ascii="Comic Sans MS" w:hAnsi="Comic Sans MS"/>
+          <w:b/>
+          <w:bCs/>
+          <w:sz w:val="24"/>
+          <w:szCs w:val="24"/>
+          <w:lang w:val="es-CO"/>
+        </w:rPr>
+        <w:t>dashboard</w:t>
+      </w:r>
+      <w:proofErr w:type="spellEnd"/>
+      <w:r>
+        <w:rPr>
+          <w:rFonts w:ascii="Comic Sans MS" w:hAnsi="Comic Sans MS"/>
+          <w:sz w:val="24"/>
+          <w:szCs w:val="24"/>
+          <w:lang w:val="es-CO"/>
+        </w:rPr>
+        <w:t>: Iniciar sesión como administrador y seleccionar "</w:t>
+      </w:r>
+      <w:proofErr w:type="spellStart"/>
+      <w:r>
+        <w:rPr>
+          <w:rFonts w:ascii="Comic Sans MS" w:hAnsi="Comic Sans MS"/>
+          <w:sz w:val="24"/>
+          <w:szCs w:val="24"/>
+          <w:lang w:val="es-CO"/>
+        </w:rPr>
+        <w:t>Dashboard</w:t>
+      </w:r>
+      <w:proofErr w:type="spellEnd"/>
+      <w:r>
+        <w:rPr>
+          <w:rFonts w:ascii="Comic Sans MS" w:hAnsi="Comic Sans MS"/>
+          <w:sz w:val="24"/>
+          <w:szCs w:val="24"/>
+          <w:lang w:val="es-CO"/>
+        </w:rPr>
+        <w:t xml:space="preserve"> </w:t>
+      </w:r>
+      <w:proofErr w:type="spellStart"/>
+      <w:r>
+        <w:rPr>
+          <w:rFonts w:ascii="Comic Sans MS" w:hAnsi="Comic Sans MS"/>
+          <w:sz w:val="24"/>
+          <w:szCs w:val="24"/>
+          <w:lang w:val="es-CO"/>
+        </w:rPr>
+        <w:t>Admin</w:t>
+      </w:r>
+      <w:proofErr w:type="spellEnd"/>
+      <w:r>
+        <w:rPr>
+          <w:rFonts w:ascii="Comic Sans MS" w:hAnsi="Comic Sans MS"/>
+          <w:sz w:val="24"/>
+          <w:szCs w:val="24"/>
+          <w:lang w:val="es-CO"/>
+        </w:rPr>
+        <w:t>"</w:t>
       </w:r>
     </w:p>
     <w:p>
@@ -4948,10 +5598,20 @@
         </w:numPr>
       </w:pPr>
       <w:bookmarkStart w:id="2" w:name="_Toc228882851"/>
-      <w:r>
-        <w:t>Gestión de Citas</w:t>
+      <w:proofErr w:type="spellStart"/>
+      <w:r>
+        <w:t>Gestión</w:t>
+      </w:r>
+      <w:proofErr w:type="spellEnd"/>
+      <w:r>
+        <w:t xml:space="preserve"> de </w:t>
+      </w:r>
+      <w:proofErr w:type="spellStart"/>
+      <w:r>
+        <w:t>Citas</w:t>
       </w:r>
       <w:bookmarkEnd w:id="2"/>
+      <w:proofErr w:type="spellEnd"/>
     </w:p>
     <w:p>
       <w:pPr>
@@ -4971,7 +5631,7 @@
           <w:noProof/>
         </w:rPr>
         <w:drawing>
-          <wp:inline distT="0" distB="0" distL="0" distR="0" wp14:anchorId="72E8ABB5" wp14:editId="0E1F482E">
+          <wp:inline distT="0" distB="0" distL="0" distR="0" wp14:anchorId="72E8ABB5" wp14:editId="7BB435D4">
             <wp:extent cx="5611154" cy="3330934"/>
             <wp:effectExtent l="0" t="0" r="8890" b="3175"/>
             <wp:docPr id="1574369494" name="Imagen 3" descr="Haz clic en Calendario de Citas..."/>
@@ -6077,7 +6737,7 @@
           <w:noProof/>
         </w:rPr>
         <w:drawing>
-          <wp:inline distT="0" distB="0" distL="0" distR="0" wp14:anchorId="7D70C83E" wp14:editId="5299712A">
+          <wp:inline distT="0" distB="0" distL="0" distR="0" wp14:anchorId="7D70C83E" wp14:editId="3CED6E7B">
             <wp:extent cx="5612130" cy="3689350"/>
             <wp:effectExtent l="0" t="0" r="7620" b="6350"/>
             <wp:docPr id="2130316497" name="Imagen 4" descr="Haz clic en Punto de Venta..."/>
@@ -6239,8 +6899,19 @@
           <w:szCs w:val="24"/>
           <w:lang w:val="es-CO"/>
         </w:rPr>
-        <w:t>: Búsqueda y selección rápida de items</w:t>
-      </w:r>
+        <w:t xml:space="preserve">: Búsqueda y selección rápida de </w:t>
+      </w:r>
+      <w:proofErr w:type="spellStart"/>
+      <w:r>
+        <w:rPr>
+          <w:rFonts w:ascii="Comic Sans MS" w:hAnsi="Comic Sans MS"/>
+          <w:sz w:val="24"/>
+          <w:szCs w:val="24"/>
+          <w:lang w:val="es-CO"/>
+        </w:rPr>
+        <w:t>items</w:t>
+      </w:r>
+      <w:proofErr w:type="spellEnd"/>
     </w:p>
     <w:p>
       <w:pPr>
@@ -7049,7 +7720,7 @@
           <w:noProof/>
         </w:rPr>
         <w:drawing>
-          <wp:inline distT="0" distB="0" distL="0" distR="0" wp14:anchorId="02FAFD90" wp14:editId="54088A64">
+          <wp:inline distT="0" distB="0" distL="0" distR="0" wp14:anchorId="02FAFD90" wp14:editId="263E3E6C">
             <wp:extent cx="5612130" cy="3689350"/>
             <wp:effectExtent l="0" t="0" r="7620" b="6350"/>
             <wp:docPr id="312939659" name="Imagen 5" descr="Haz clic en Gestión de Inventario..."/>
@@ -7804,7 +8475,7 @@
           <w:noProof/>
         </w:rPr>
         <w:drawing>
-          <wp:inline distT="0" distB="0" distL="0" distR="0" wp14:anchorId="382F7349" wp14:editId="6B7E11C7">
+          <wp:inline distT="0" distB="0" distL="0" distR="0" wp14:anchorId="382F7349" wp14:editId="48A61346">
             <wp:extent cx="5612130" cy="3689350"/>
             <wp:effectExtent l="0" t="0" r="7620" b="6350"/>
             <wp:docPr id="43424469" name="Imagen 6" descr="Haz clic en Historial de Ventas..."/>
@@ -8691,7 +9362,7 @@
           <w:noProof/>
         </w:rPr>
         <w:drawing>
-          <wp:inline distT="0" distB="0" distL="0" distR="0" wp14:anchorId="6E5FEDDE" wp14:editId="7E78ECDF">
+          <wp:inline distT="0" distB="0" distL="0" distR="0" wp14:anchorId="6E5FEDDE" wp14:editId="20F741DA">
             <wp:extent cx="5612130" cy="3689350"/>
             <wp:effectExtent l="0" t="0" r="7620" b="6350"/>
             <wp:docPr id="506146340" name="Imagen 7" descr="Haz clic en Usuarios de la Empresa..."/>
@@ -8945,7 +9616,27 @@
           <w:szCs w:val="24"/>
           <w:lang w:val="es-CO"/>
         </w:rPr>
-        <w:t>: Asignación de roles (admin, estilista, recepción, etc.)</w:t>
+        <w:t>: Asignación de roles (</w:t>
+      </w:r>
+      <w:proofErr w:type="spellStart"/>
+      <w:r>
+        <w:rPr>
+          <w:rFonts w:ascii="Comic Sans MS" w:hAnsi="Comic Sans MS"/>
+          <w:sz w:val="24"/>
+          <w:szCs w:val="24"/>
+          <w:lang w:val="es-CO"/>
+        </w:rPr>
+        <w:t>admin</w:t>
+      </w:r>
+      <w:proofErr w:type="spellEnd"/>
+      <w:r>
+        <w:rPr>
+          <w:rFonts w:ascii="Comic Sans MS" w:hAnsi="Comic Sans MS"/>
+          <w:sz w:val="24"/>
+          <w:szCs w:val="24"/>
+          <w:lang w:val="es-CO"/>
+        </w:rPr>
+        <w:t>, estilista, recepción, etc.)</w:t>
       </w:r>
     </w:p>
     <w:p>
@@ -9578,7 +10269,7 @@
           <w:noProof/>
         </w:rPr>
         <w:drawing>
-          <wp:inline distT="0" distB="0" distL="0" distR="0" wp14:anchorId="7B4DBD5E" wp14:editId="31F64071">
+          <wp:inline distT="0" distB="0" distL="0" distR="0" wp14:anchorId="7B4DBD5E" wp14:editId="52584FB9">
             <wp:extent cx="5612130" cy="3689350"/>
             <wp:effectExtent l="0" t="0" r="7620" b="6350"/>
             <wp:docPr id="1345918738" name="Imagen 8" descr="Haz clic en Gestión de Empleados..."/>
@@ -10524,7 +11215,7 @@
           <w:noProof/>
         </w:rPr>
         <w:drawing>
-          <wp:inline distT="0" distB="0" distL="0" distR="0" wp14:anchorId="03C49586" wp14:editId="26C0151A">
+          <wp:inline distT="0" distB="0" distL="0" distR="0" wp14:anchorId="03C49586" wp14:editId="72F8EAE5">
             <wp:extent cx="5612130" cy="3689350"/>
             <wp:effectExtent l="0" t="0" r="7620" b="6350"/>
             <wp:docPr id="2141880977" name="Imagen 9" descr="Haz clic en Clientes..."/>
@@ -11404,11 +12095,13 @@
         </w:numPr>
       </w:pPr>
       <w:bookmarkStart w:id="9" w:name="_Toc228882858"/>
+      <w:proofErr w:type="spellStart"/>
       <w:r>
         <w:lastRenderedPageBreak/>
         <w:t>Servicios</w:t>
       </w:r>
       <w:bookmarkEnd w:id="9"/>
+      <w:proofErr w:type="spellEnd"/>
     </w:p>
     <w:p>
       <w:pPr>
@@ -11427,7 +12120,7 @@
           <w:noProof/>
         </w:rPr>
         <w:drawing>
-          <wp:inline distT="0" distB="0" distL="0" distR="0" wp14:anchorId="0EBB84AD" wp14:editId="53CE2722">
+          <wp:inline distT="0" distB="0" distL="0" distR="0" wp14:anchorId="0EBB84AD" wp14:editId="08A9BE5F">
             <wp:extent cx="5612130" cy="3689350"/>
             <wp:effectExtent l="0" t="0" r="7620" b="6350"/>
             <wp:docPr id="1190141931" name="Imagen 10" descr="Haz clic en Gestión de Servicios..."/>
@@ -12416,10 +13109,12 @@
         </w:numPr>
       </w:pPr>
       <w:bookmarkStart w:id="10" w:name="_Toc228882859"/>
+      <w:proofErr w:type="spellStart"/>
       <w:r>
         <w:t>Productos</w:t>
       </w:r>
       <w:bookmarkEnd w:id="10"/>
+      <w:proofErr w:type="spellEnd"/>
     </w:p>
     <w:p>
       <w:pPr>
@@ -12438,7 +13133,7 @@
           <w:noProof/>
         </w:rPr>
         <w:drawing>
-          <wp:inline distT="0" distB="0" distL="0" distR="0" wp14:anchorId="273654FA" wp14:editId="5A2F381A">
+          <wp:inline distT="0" distB="0" distL="0" distR="0" wp14:anchorId="273654FA" wp14:editId="1CB28BCB">
             <wp:extent cx="5612130" cy="3689350"/>
             <wp:effectExtent l="0" t="0" r="7620" b="6350"/>
             <wp:docPr id="1805737754" name="Imagen 11" descr="Haz clic en Gestión de Productos..."/>
@@ -13466,7 +14161,7 @@
           <w:noProof/>
         </w:rPr>
         <w:drawing>
-          <wp:inline distT="0" distB="0" distL="0" distR="0" wp14:anchorId="6D7615B9" wp14:editId="7A81A1F5">
+          <wp:inline distT="0" distB="0" distL="0" distR="0" wp14:anchorId="6D7615B9" wp14:editId="33E96ACA">
             <wp:extent cx="5612130" cy="3689350"/>
             <wp:effectExtent l="0" t="0" r="7620" b="6350"/>
             <wp:docPr id="1137310179" name="Imagen 12" descr="Haz clic en Gestión de Proveedores..."/>
@@ -14389,7 +15084,7 @@
           <w:noProof/>
         </w:rPr>
         <w:drawing>
-          <wp:inline distT="0" distB="0" distL="0" distR="0" wp14:anchorId="4AF287EE" wp14:editId="3925CEF7">
+          <wp:inline distT="0" distB="0" distL="0" distR="0" wp14:anchorId="4AF287EE" wp14:editId="12CBEA55">
             <wp:extent cx="5612130" cy="3689350"/>
             <wp:effectExtent l="0" t="0" r="7620" b="6350"/>
             <wp:docPr id="1768986767" name="Imagen 13" descr="Haz clic en Gestión de Categorías..."/>
@@ -15314,7 +16009,7 @@
           <w:noProof/>
         </w:rPr>
         <w:drawing>
-          <wp:inline distT="0" distB="0" distL="0" distR="0" wp14:anchorId="42C0C706" wp14:editId="1DBFFA36">
+          <wp:inline distT="0" distB="0" distL="0" distR="0" wp14:anchorId="42C0C706" wp14:editId="29433819">
             <wp:extent cx="5612130" cy="3689350"/>
             <wp:effectExtent l="0" t="0" r="7620" b="6350"/>
             <wp:docPr id="206603799" name="Imagen 14" descr="Haz clic en Préstamos..."/>
@@ -16297,7 +16992,7 @@
           <w:noProof/>
         </w:rPr>
         <w:drawing>
-          <wp:inline distT="0" distB="0" distL="0" distR="0" wp14:anchorId="523D3897" wp14:editId="576D8317">
+          <wp:inline distT="0" distB="0" distL="0" distR="0" wp14:anchorId="523D3897" wp14:editId="29D9F2C5">
             <wp:extent cx="5612130" cy="3204376"/>
             <wp:effectExtent l="0" t="0" r="7620" b="0"/>
             <wp:docPr id="1777626001" name="Imagen 15" descr="Haz clic en Módulo de Nómina..."/>
@@ -17314,7 +18009,7 @@
           <w:noProof/>
         </w:rPr>
         <w:drawing>
-          <wp:inline distT="0" distB="0" distL="0" distR="0" wp14:anchorId="263A86EC" wp14:editId="26B70CA9">
+          <wp:inline distT="0" distB="0" distL="0" distR="0" wp14:anchorId="263A86EC" wp14:editId="09FF7FE4">
             <wp:extent cx="5611213" cy="2830665"/>
             <wp:effectExtent l="0" t="0" r="8890" b="8255"/>
             <wp:docPr id="529753910" name="Imagen 16" descr="Haz clic en Todas las Comisiones..."/>
@@ -18169,7 +18864,7 @@
           <w:rFonts w:ascii="Comic Sans MS" w:hAnsi="Comic Sans MS"/>
           <w:sz w:val="24"/>
           <w:szCs w:val="24"/>
-          <w:lang w:val="es-CO"/>
+          <w:lang w:val="pt-PT"/>
         </w:rPr>
       </w:pPr>
     </w:p>
@@ -18211,7 +18906,7 @@
           <w:noProof/>
         </w:rPr>
         <w:drawing>
-          <wp:inline distT="0" distB="0" distL="0" distR="0" wp14:anchorId="247F35C2" wp14:editId="62C60667">
+          <wp:inline distT="0" distB="0" distL="0" distR="0" wp14:anchorId="247F35C2" wp14:editId="4F304623">
             <wp:extent cx="5612130" cy="3689350"/>
             <wp:effectExtent l="0" t="0" r="7620" b="6350"/>
             <wp:docPr id="844618366" name="Imagen 17" descr="Haz clic en Finanzas..."/>
@@ -18716,7 +19411,31 @@
           <w:szCs w:val="24"/>
           <w:lang w:val="es-CO"/>
         </w:rPr>
-        <w:t>Ver dashboard financiero</w:t>
+        <w:t xml:space="preserve">Ver </w:t>
+      </w:r>
+      <w:proofErr w:type="spellStart"/>
+      <w:r>
+        <w:rPr>
+          <w:rFonts w:ascii="Comic Sans MS" w:hAnsi="Comic Sans MS"/>
+          <w:b/>
+          <w:bCs/>
+          <w:sz w:val="24"/>
+          <w:szCs w:val="24"/>
+          <w:lang w:val="es-CO"/>
+        </w:rPr>
+        <w:t>dashboard</w:t>
+      </w:r>
+      <w:proofErr w:type="spellEnd"/>
+      <w:r>
+        <w:rPr>
+          <w:rFonts w:ascii="Comic Sans MS" w:hAnsi="Comic Sans MS"/>
+          <w:b/>
+          <w:bCs/>
+          <w:sz w:val="24"/>
+          <w:szCs w:val="24"/>
+          <w:lang w:val="es-CO"/>
+        </w:rPr>
+        <w:t xml:space="preserve"> financiero</w:t>
       </w:r>
       <w:r>
         <w:rPr>
@@ -19181,7 +19900,7 @@
           <w:noProof/>
         </w:rPr>
         <w:drawing>
-          <wp:inline distT="0" distB="0" distL="0" distR="0" wp14:anchorId="431BB24E" wp14:editId="73536D71">
+          <wp:inline distT="0" distB="0" distL="0" distR="0" wp14:anchorId="431BB24E" wp14:editId="0C771368">
             <wp:extent cx="5612130" cy="3689350"/>
             <wp:effectExtent l="0" t="0" r="7620" b="6350"/>
             <wp:docPr id="1407379905" name="Imagen 18" descr="Haz clic en Marketing y Fidelización..."/>
@@ -20173,7 +20892,7 @@
           <w:noProof/>
         </w:rPr>
         <w:drawing>
-          <wp:inline distT="0" distB="0" distL="0" distR="0" wp14:anchorId="02DB14F5" wp14:editId="7B456B3C">
+          <wp:inline distT="0" distB="0" distL="0" distR="0" wp14:anchorId="02DB14F5" wp14:editId="7772DC37">
             <wp:extent cx="5612130" cy="3156668"/>
             <wp:effectExtent l="0" t="0" r="7620" b="5715"/>
             <wp:docPr id="1362747587" name="Imagen 19" descr="Haz clic en Analíticas y Reportes..."/>
@@ -20304,25 +21023,58 @@
           <w:lang w:val="es-CO"/>
         </w:rPr>
       </w:pPr>
-      <w:r>
-        <w:rPr>
-          <w:rFonts w:ascii="Comic Sans MS" w:hAnsi="Comic Sans MS"/>
-          <w:b/>
-          <w:bCs/>
-          <w:sz w:val="24"/>
-          <w:szCs w:val="24"/>
-          <w:lang w:val="es-CO"/>
-        </w:rPr>
-        <w:t>Dashboard ejecutivo</w:t>
-      </w:r>
-      <w:r>
-        <w:rPr>
-          <w:rFonts w:ascii="Comic Sans MS" w:hAnsi="Comic Sans MS"/>
-          <w:sz w:val="24"/>
-          <w:szCs w:val="24"/>
-          <w:lang w:val="es-CO"/>
-        </w:rPr>
-        <w:t>: Vista principal con KPIs clave del negocio</w:t>
+      <w:proofErr w:type="spellStart"/>
+      <w:r>
+        <w:rPr>
+          <w:rFonts w:ascii="Comic Sans MS" w:hAnsi="Comic Sans MS"/>
+          <w:b/>
+          <w:bCs/>
+          <w:sz w:val="24"/>
+          <w:szCs w:val="24"/>
+          <w:lang w:val="es-CO"/>
+        </w:rPr>
+        <w:t>Dashboard</w:t>
+      </w:r>
+      <w:proofErr w:type="spellEnd"/>
+      <w:r>
+        <w:rPr>
+          <w:rFonts w:ascii="Comic Sans MS" w:hAnsi="Comic Sans MS"/>
+          <w:b/>
+          <w:bCs/>
+          <w:sz w:val="24"/>
+          <w:szCs w:val="24"/>
+          <w:lang w:val="es-CO"/>
+        </w:rPr>
+        <w:t xml:space="preserve"> ejecutivo</w:t>
+      </w:r>
+      <w:r>
+        <w:rPr>
+          <w:rFonts w:ascii="Comic Sans MS" w:hAnsi="Comic Sans MS"/>
+          <w:sz w:val="24"/>
+          <w:szCs w:val="24"/>
+          <w:lang w:val="es-CO"/>
+        </w:rPr>
+        <w:t xml:space="preserve">: Vista principal con </w:t>
+      </w:r>
+      <w:proofErr w:type="spellStart"/>
+      <w:r>
+        <w:rPr>
+          <w:rFonts w:ascii="Comic Sans MS" w:hAnsi="Comic Sans MS"/>
+          <w:sz w:val="24"/>
+          <w:szCs w:val="24"/>
+          <w:lang w:val="es-CO"/>
+        </w:rPr>
+        <w:t>KPIs</w:t>
+      </w:r>
+      <w:proofErr w:type="spellEnd"/>
+      <w:r>
+        <w:rPr>
+          <w:rFonts w:ascii="Comic Sans MS" w:hAnsi="Comic Sans MS"/>
+          <w:sz w:val="24"/>
+          <w:szCs w:val="24"/>
+          <w:lang w:val="es-CO"/>
+        </w:rPr>
+        <w:t xml:space="preserve"> clave del negocio</w:t>
       </w:r>
     </w:p>
     <w:p>
@@ -20700,16 +21452,60 @@
           <w:szCs w:val="24"/>
           <w:lang w:val="es-CO"/>
         </w:rPr>
-        <w:t>Ver dashboard principal</w:t>
-      </w:r>
-      <w:r>
-        <w:rPr>
-          <w:rFonts w:ascii="Comic Sans MS" w:hAnsi="Comic Sans MS"/>
-          <w:sz w:val="24"/>
-          <w:szCs w:val="24"/>
-          <w:lang w:val="es-CO"/>
-        </w:rPr>
-        <w:t>: La pantalla muestra KPIs clave del negocio</w:t>
+        <w:t xml:space="preserve">Ver </w:t>
+      </w:r>
+      <w:proofErr w:type="spellStart"/>
+      <w:r>
+        <w:rPr>
+          <w:rFonts w:ascii="Comic Sans MS" w:hAnsi="Comic Sans MS"/>
+          <w:b/>
+          <w:bCs/>
+          <w:sz w:val="24"/>
+          <w:szCs w:val="24"/>
+          <w:lang w:val="es-CO"/>
+        </w:rPr>
+        <w:t>dashboard</w:t>
+      </w:r>
+      <w:proofErr w:type="spellEnd"/>
+      <w:r>
+        <w:rPr>
+          <w:rFonts w:ascii="Comic Sans MS" w:hAnsi="Comic Sans MS"/>
+          <w:b/>
+          <w:bCs/>
+          <w:sz w:val="24"/>
+          <w:szCs w:val="24"/>
+          <w:lang w:val="es-CO"/>
+        </w:rPr>
+        <w:t xml:space="preserve"> principal</w:t>
+      </w:r>
+      <w:r>
+        <w:rPr>
+          <w:rFonts w:ascii="Comic Sans MS" w:hAnsi="Comic Sans MS"/>
+          <w:sz w:val="24"/>
+          <w:szCs w:val="24"/>
+          <w:lang w:val="es-CO"/>
+        </w:rPr>
+        <w:t xml:space="preserve">: La pantalla muestra </w:t>
+      </w:r>
+      <w:proofErr w:type="spellStart"/>
+      <w:r>
+        <w:rPr>
+          <w:rFonts w:ascii="Comic Sans MS" w:hAnsi="Comic Sans MS"/>
+          <w:sz w:val="24"/>
+          <w:szCs w:val="24"/>
+          <w:lang w:val="es-CO"/>
+        </w:rPr>
+        <w:t>KPIs</w:t>
+      </w:r>
+      <w:proofErr w:type="spellEnd"/>
+      <w:r>
+        <w:rPr>
+          <w:rFonts w:ascii="Comic Sans MS" w:hAnsi="Comic Sans MS"/>
+          <w:sz w:val="24"/>
+          <w:szCs w:val="24"/>
+          <w:lang w:val="es-CO"/>
+        </w:rPr>
+        <w:t xml:space="preserve"> clave del negocio</w:t>
       </w:r>
     </w:p>
     <w:p>
@@ -21490,8 +22286,19 @@
           <w:szCs w:val="24"/>
           <w:lang w:val="es-CO"/>
         </w:rPr>
-        <w:t>: Configuración de servicios externos y APIs</w:t>
-      </w:r>
+        <w:t xml:space="preserve">: Configuración de servicios externos y </w:t>
+      </w:r>
+      <w:proofErr w:type="spellStart"/>
+      <w:r>
+        <w:rPr>
+          <w:rFonts w:ascii="Comic Sans MS" w:hAnsi="Comic Sans MS"/>
+          <w:sz w:val="24"/>
+          <w:szCs w:val="24"/>
+          <w:lang w:val="es-CO"/>
+        </w:rPr>
+        <w:t>APIs</w:t>
+      </w:r>
+      <w:proofErr w:type="spellEnd"/>
     </w:p>
     <w:p>
       <w:pPr>
@@ -22106,8 +22913,39 @@
           <w:szCs w:val="24"/>
           <w:lang w:val="es-CO"/>
         </w:rPr>
-        <w:t>Configurar APIs y webhooks</w:t>
-      </w:r>
+        <w:t xml:space="preserve">Configurar </w:t>
+      </w:r>
+      <w:proofErr w:type="spellStart"/>
+      <w:r>
+        <w:rPr>
+          <w:rFonts w:ascii="Comic Sans MS" w:hAnsi="Comic Sans MS"/>
+          <w:sz w:val="24"/>
+          <w:szCs w:val="24"/>
+          <w:lang w:val="es-CO"/>
+        </w:rPr>
+        <w:t>APIs</w:t>
+      </w:r>
+      <w:proofErr w:type="spellEnd"/>
+      <w:r>
+        <w:rPr>
+          <w:rFonts w:ascii="Comic Sans MS" w:hAnsi="Comic Sans MS"/>
+          <w:sz w:val="24"/>
+          <w:szCs w:val="24"/>
+          <w:lang w:val="es-CO"/>
+        </w:rPr>
+        <w:t xml:space="preserve"> y </w:t>
+      </w:r>
+      <w:proofErr w:type="spellStart"/>
+      <w:r>
+        <w:rPr>
+          <w:rFonts w:ascii="Comic Sans MS" w:hAnsi="Comic Sans MS"/>
+          <w:sz w:val="24"/>
+          <w:szCs w:val="24"/>
+          <w:lang w:val="es-CO"/>
+        </w:rPr>
+        <w:t>webhooks</w:t>
+      </w:r>
+      <w:proofErr w:type="spellEnd"/>
     </w:p>
     <w:p>
       <w:pPr>
@@ -22182,7 +23020,7 @@
           <w:noProof/>
         </w:rPr>
         <w:drawing>
-          <wp:inline distT="0" distB="0" distL="0" distR="0" wp14:anchorId="5E661787" wp14:editId="3150ADD4">
+          <wp:inline distT="0" distB="0" distL="0" distR="0" wp14:anchorId="5E661787" wp14:editId="78A89BED">
             <wp:extent cx="5611839" cy="2886324"/>
             <wp:effectExtent l="0" t="0" r="8255" b="9525"/>
             <wp:docPr id="525423263" name="Imagen 21" descr="Click on Centro de Soporte…"/>
@@ -23245,7 +24083,21 @@
           <w:lang w:val="es-CO"/>
         </w:rPr>
         <w:lastRenderedPageBreak/>
-        <w:t>Panel de Administración (Admin)</w:t>
+        <w:t>Panel de Administración (</w:t>
+      </w:r>
+      <w:proofErr w:type="spellStart"/>
+      <w:r>
+        <w:rPr>
+          <w:lang w:val="es-CO"/>
+        </w:rPr>
+        <w:t>Admin</w:t>
+      </w:r>
+      <w:proofErr w:type="spellEnd"/>
+      <w:r>
+        <w:rPr>
+          <w:lang w:val="es-CO"/>
+        </w:rPr>
+        <w:t>)</w:t>
       </w:r>
       <w:bookmarkEnd w:id="21"/>
     </w:p>
@@ -23266,7 +24118,7 @@
           <w:noProof/>
         </w:rPr>
         <w:drawing>
-          <wp:inline distT="0" distB="0" distL="0" distR="0" wp14:anchorId="237A1180" wp14:editId="30B752FE">
+          <wp:inline distT="0" distB="0" distL="0" distR="0" wp14:anchorId="237A1180" wp14:editId="69302FDA">
             <wp:extent cx="5612130" cy="3689350"/>
             <wp:effectExtent l="0" t="0" r="7620" b="6350"/>
             <wp:docPr id="1542968709" name="Imagen 24" descr="Click on Dashboard Global…"/>
@@ -23415,16 +24267,29 @@
           <w:lang w:val="es-CO"/>
         </w:rPr>
       </w:pPr>
-      <w:r>
-        <w:rPr>
-          <w:rFonts w:ascii="Comic Sans MS" w:hAnsi="Comic Sans MS"/>
-          <w:b/>
-          <w:bCs/>
-          <w:sz w:val="24"/>
-          <w:szCs w:val="24"/>
-          <w:lang w:val="es-CO"/>
-        </w:rPr>
-        <w:t>Dashboard administrativo</w:t>
+      <w:proofErr w:type="spellStart"/>
+      <w:r>
+        <w:rPr>
+          <w:rFonts w:ascii="Comic Sans MS" w:hAnsi="Comic Sans MS"/>
+          <w:b/>
+          <w:bCs/>
+          <w:sz w:val="24"/>
+          <w:szCs w:val="24"/>
+          <w:lang w:val="es-CO"/>
+        </w:rPr>
+        <w:t>Dashboard</w:t>
+      </w:r>
+      <w:proofErr w:type="spellEnd"/>
+      <w:r>
+        <w:rPr>
+          <w:rFonts w:ascii="Comic Sans MS" w:hAnsi="Comic Sans MS"/>
+          <w:b/>
+          <w:bCs/>
+          <w:sz w:val="24"/>
+          <w:szCs w:val="24"/>
+          <w:lang w:val="es-CO"/>
+        </w:rPr>
+        <w:t xml:space="preserve"> administrativo</w:t>
       </w:r>
       <w:r>
         <w:rPr>
@@ -23679,8 +24544,19 @@
           <w:szCs w:val="24"/>
           <w:lang w:val="es-CO"/>
         </w:rPr>
-        <w:t>: Control de acceso al panel admin</w:t>
-      </w:r>
+        <w:t xml:space="preserve">: Control de acceso al panel </w:t>
+      </w:r>
+      <w:proofErr w:type="spellStart"/>
+      <w:r>
+        <w:rPr>
+          <w:rFonts w:ascii="Comic Sans MS" w:hAnsi="Comic Sans MS"/>
+          <w:sz w:val="24"/>
+          <w:szCs w:val="24"/>
+          <w:lang w:val="es-CO"/>
+        </w:rPr>
+        <w:t>admin</w:t>
+      </w:r>
+      <w:proofErr w:type="spellEnd"/>
     </w:p>
     <w:p>
       <w:pPr>
@@ -23750,8 +24626,19 @@
           <w:szCs w:val="24"/>
           <w:lang w:val="es-CO"/>
         </w:rPr>
-        <w:t>: Usar credenciales de administrador para ingresar al panel admin</w:t>
-      </w:r>
+        <w:t xml:space="preserve">: Usar credenciales de administrador para ingresar al panel </w:t>
+      </w:r>
+      <w:proofErr w:type="spellStart"/>
+      <w:r>
+        <w:rPr>
+          <w:rFonts w:ascii="Comic Sans MS" w:hAnsi="Comic Sans MS"/>
+          <w:sz w:val="24"/>
+          <w:szCs w:val="24"/>
+          <w:lang w:val="es-CO"/>
+        </w:rPr>
+        <w:t>admin</w:t>
+      </w:r>
+      <w:proofErr w:type="spellEnd"/>
     </w:p>
     <w:p>
       <w:pPr>
@@ -23776,7 +24663,31 @@
           <w:szCs w:val="24"/>
           <w:lang w:val="es-CO"/>
         </w:rPr>
-        <w:t>Ver dashboard principal</w:t>
+        <w:t xml:space="preserve">Ver </w:t>
+      </w:r>
+      <w:proofErr w:type="spellStart"/>
+      <w:r>
+        <w:rPr>
+          <w:rFonts w:ascii="Comic Sans MS" w:hAnsi="Comic Sans MS"/>
+          <w:b/>
+          <w:bCs/>
+          <w:sz w:val="24"/>
+          <w:szCs w:val="24"/>
+          <w:lang w:val="es-CO"/>
+        </w:rPr>
+        <w:t>dashboard</w:t>
+      </w:r>
+      <w:proofErr w:type="spellEnd"/>
+      <w:r>
+        <w:rPr>
+          <w:rFonts w:ascii="Comic Sans MS" w:hAnsi="Comic Sans MS"/>
+          <w:b/>
+          <w:bCs/>
+          <w:sz w:val="24"/>
+          <w:szCs w:val="24"/>
+          <w:lang w:val="es-CO"/>
+        </w:rPr>
+        <w:t xml:space="preserve"> principal</w:t>
       </w:r>
       <w:r>
         <w:rPr>
@@ -24233,7 +25144,21 @@
           <w:lang w:val="es-CO"/>
         </w:rPr>
         <w:lastRenderedPageBreak/>
-        <w:t>Gestión de Empresas (Admin)</w:t>
+        <w:t>Gestión de Empresas (</w:t>
+      </w:r>
+      <w:proofErr w:type="spellStart"/>
+      <w:r>
+        <w:rPr>
+          <w:lang w:val="es-CO"/>
+        </w:rPr>
+        <w:t>Admin</w:t>
+      </w:r>
+      <w:proofErr w:type="spellEnd"/>
+      <w:r>
+        <w:rPr>
+          <w:lang w:val="es-CO"/>
+        </w:rPr>
+        <w:t>)</w:t>
       </w:r>
       <w:bookmarkEnd w:id="22"/>
     </w:p>
@@ -24254,7 +25179,7 @@
           <w:noProof/>
         </w:rPr>
         <w:drawing>
-          <wp:inline distT="0" distB="0" distL="0" distR="0" wp14:anchorId="11972973" wp14:editId="5BA053AF">
+          <wp:inline distT="0" distB="0" distL="0" distR="0" wp14:anchorId="11972973" wp14:editId="78156E2A">
             <wp:extent cx="5612130" cy="3689350"/>
             <wp:effectExtent l="0" t="0" r="7620" b="6350"/>
             <wp:docPr id="53747486" name="Imagen 25" descr="Click on Gestión de Empresas…"/>
@@ -24749,7 +25674,27 @@
           <w:szCs w:val="24"/>
           <w:lang w:val="es-CO"/>
         </w:rPr>
-        <w:t>: Desde el panel admin, seleccionar "Empresas"</w:t>
+        <w:t xml:space="preserve">: Desde el panel </w:t>
+      </w:r>
+      <w:proofErr w:type="spellStart"/>
+      <w:r>
+        <w:rPr>
+          <w:rFonts w:ascii="Comic Sans MS" w:hAnsi="Comic Sans MS"/>
+          <w:sz w:val="24"/>
+          <w:szCs w:val="24"/>
+          <w:lang w:val="es-CO"/>
+        </w:rPr>
+        <w:t>admin</w:t>
+      </w:r>
+      <w:proofErr w:type="spellEnd"/>
+      <w:r>
+        <w:rPr>
+          <w:rFonts w:ascii="Comic Sans MS" w:hAnsi="Comic Sans MS"/>
+          <w:sz w:val="24"/>
+          <w:szCs w:val="24"/>
+          <w:lang w:val="es-CO"/>
+        </w:rPr>
+        <w:t>, seleccionar "Empresas"</w:t>
       </w:r>
     </w:p>
     <w:p>
@@ -25330,7 +26275,7 @@
           <w:rFonts w:ascii="Comic Sans MS" w:hAnsi="Comic Sans MS"/>
           <w:sz w:val="24"/>
           <w:szCs w:val="24"/>
-          <w:lang w:val="es-CO"/>
+          <w:lang w:val="pt-PT"/>
         </w:rPr>
       </w:pPr>
     </w:p>
@@ -25350,7 +26295,21 @@
         <w:rPr>
           <w:lang w:val="es-CO"/>
         </w:rPr>
-        <w:t>Finanzas Administrativas (Admin)</w:t>
+        <w:t>Finanzas Administrativas (</w:t>
+      </w:r>
+      <w:proofErr w:type="spellStart"/>
+      <w:r>
+        <w:rPr>
+          <w:lang w:val="es-CO"/>
+        </w:rPr>
+        <w:t>Admin</w:t>
+      </w:r>
+      <w:proofErr w:type="spellEnd"/>
+      <w:r>
+        <w:rPr>
+          <w:lang w:val="es-CO"/>
+        </w:rPr>
+        <w:t>)</w:t>
       </w:r>
       <w:bookmarkEnd w:id="23"/>
     </w:p>
@@ -25371,7 +26330,7 @@
           <w:noProof/>
         </w:rPr>
         <w:drawing>
-          <wp:inline distT="0" distB="0" distL="0" distR="0" wp14:anchorId="27F44194" wp14:editId="7C6F79CB">
+          <wp:inline distT="0" distB="0" distL="0" distR="0" wp14:anchorId="27F44194" wp14:editId="3C71E2C5">
             <wp:extent cx="5612130" cy="3212327"/>
             <wp:effectExtent l="0" t="0" r="7620" b="7620"/>
             <wp:docPr id="1528114528" name="Imagen 26" descr="Click on Reporte Financiero…"/>
@@ -25855,7 +26814,27 @@
           <w:szCs w:val="24"/>
           <w:lang w:val="es-CO"/>
         </w:rPr>
-        <w:t>: Desde el panel admin, seleccionar "Finanzas"</w:t>
+        <w:t xml:space="preserve">: Desde el panel </w:t>
+      </w:r>
+      <w:proofErr w:type="spellStart"/>
+      <w:r>
+        <w:rPr>
+          <w:rFonts w:ascii="Comic Sans MS" w:hAnsi="Comic Sans MS"/>
+          <w:sz w:val="24"/>
+          <w:szCs w:val="24"/>
+          <w:lang w:val="es-CO"/>
+        </w:rPr>
+        <w:t>admin</w:t>
+      </w:r>
+      <w:proofErr w:type="spellEnd"/>
+      <w:r>
+        <w:rPr>
+          <w:rFonts w:ascii="Comic Sans MS" w:hAnsi="Comic Sans MS"/>
+          <w:sz w:val="24"/>
+          <w:szCs w:val="24"/>
+          <w:lang w:val="es-CO"/>
+        </w:rPr>
+        <w:t>, seleccionar "Finanzas"</w:t>
       </w:r>
     </w:p>
     <w:p>
@@ -26535,7 +27514,21 @@
           <w:lang w:val="es-CO"/>
         </w:rPr>
         <w:lastRenderedPageBreak/>
-        <w:t>Gestión de Suscripciones (Admin)</w:t>
+        <w:t>Gestión de Suscripciones (</w:t>
+      </w:r>
+      <w:proofErr w:type="spellStart"/>
+      <w:r>
+        <w:rPr>
+          <w:lang w:val="es-CO"/>
+        </w:rPr>
+        <w:t>Admin</w:t>
+      </w:r>
+      <w:proofErr w:type="spellEnd"/>
+      <w:r>
+        <w:rPr>
+          <w:lang w:val="es-CO"/>
+        </w:rPr>
+        <w:t>)</w:t>
       </w:r>
       <w:bookmarkEnd w:id="24"/>
     </w:p>
@@ -26556,7 +27549,7 @@
           <w:noProof/>
         </w:rPr>
         <w:drawing>
-          <wp:inline distT="0" distB="0" distL="0" distR="0" wp14:anchorId="78A2B8A3" wp14:editId="6048ED93">
+          <wp:inline distT="0" distB="0" distL="0" distR="0" wp14:anchorId="78A2B8A3" wp14:editId="6CB37A90">
             <wp:extent cx="5612130" cy="3689350"/>
             <wp:effectExtent l="0" t="0" r="7620" b="6350"/>
             <wp:docPr id="131988276" name="Imagen 27" descr="Click on Gestión de Suscripciones…"/>
@@ -27040,7 +28033,27 @@
           <w:szCs w:val="24"/>
           <w:lang w:val="es-CO"/>
         </w:rPr>
-        <w:t>: Desde el panel admin, seleccionar "Suscripciones"</w:t>
+        <w:t xml:space="preserve">: Desde el panel </w:t>
+      </w:r>
+      <w:proofErr w:type="spellStart"/>
+      <w:r>
+        <w:rPr>
+          <w:rFonts w:ascii="Comic Sans MS" w:hAnsi="Comic Sans MS"/>
+          <w:sz w:val="24"/>
+          <w:szCs w:val="24"/>
+          <w:lang w:val="es-CO"/>
+        </w:rPr>
+        <w:t>admin</w:t>
+      </w:r>
+      <w:proofErr w:type="spellEnd"/>
+      <w:r>
+        <w:rPr>
+          <w:rFonts w:ascii="Comic Sans MS" w:hAnsi="Comic Sans MS"/>
+          <w:sz w:val="24"/>
+          <w:szCs w:val="24"/>
+          <w:lang w:val="es-CO"/>
+        </w:rPr>
+        <w:t>, seleccionar "Suscripciones"</w:t>
       </w:r>
     </w:p>
     <w:p>
@@ -27665,7 +28678,21 @@
         <w:rPr>
           <w:lang w:val="es-CO"/>
         </w:rPr>
-        <w:t>Auditoría del Sistema (Admin)</w:t>
+        <w:t>Auditoría del Sistema (</w:t>
+      </w:r>
+      <w:proofErr w:type="spellStart"/>
+      <w:r>
+        <w:rPr>
+          <w:lang w:val="es-CO"/>
+        </w:rPr>
+        <w:t>Admin</w:t>
+      </w:r>
+      <w:proofErr w:type="spellEnd"/>
+      <w:r>
+        <w:rPr>
+          <w:lang w:val="es-CO"/>
+        </w:rPr>
+        <w:t>)</w:t>
       </w:r>
       <w:bookmarkEnd w:id="25"/>
     </w:p>
@@ -27686,7 +28713,7 @@
           <w:noProof/>
         </w:rPr>
         <w:drawing>
-          <wp:inline distT="0" distB="0" distL="0" distR="0" wp14:anchorId="01548AA5" wp14:editId="379B6A47">
+          <wp:inline distT="0" distB="0" distL="0" distR="0" wp14:anchorId="01548AA5" wp14:editId="295CEB16">
             <wp:extent cx="5612130" cy="3689350"/>
             <wp:effectExtent l="0" t="0" r="7620" b="6350"/>
             <wp:docPr id="652925104" name="Imagen 28" descr="Click on Centro de Auditoría Global…"/>
@@ -28174,7 +29201,27 @@
           <w:szCs w:val="24"/>
           <w:lang w:val="es-CO"/>
         </w:rPr>
-        <w:t>: Desde el panel admin, seleccionar "Auditoría"</w:t>
+        <w:t xml:space="preserve">: Desde el panel </w:t>
+      </w:r>
+      <w:proofErr w:type="spellStart"/>
+      <w:r>
+        <w:rPr>
+          <w:rFonts w:ascii="Comic Sans MS" w:hAnsi="Comic Sans MS"/>
+          <w:sz w:val="24"/>
+          <w:szCs w:val="24"/>
+          <w:lang w:val="es-CO"/>
+        </w:rPr>
+        <w:t>admin</w:t>
+      </w:r>
+      <w:proofErr w:type="spellEnd"/>
+      <w:r>
+        <w:rPr>
+          <w:rFonts w:ascii="Comic Sans MS" w:hAnsi="Comic Sans MS"/>
+          <w:sz w:val="24"/>
+          <w:szCs w:val="24"/>
+          <w:lang w:val="es-CO"/>
+        </w:rPr>
+        <w:t>, seleccionar "Auditoría"</w:t>
       </w:r>
     </w:p>
     <w:p>
@@ -28800,7 +29847,21 @@
         <w:rPr>
           <w:lang w:val="es-CO"/>
         </w:rPr>
-        <w:t>Gestión de Usuarios Administrativos (Admin)</w:t>
+        <w:t>Gestión de Usuarios Administrativos (</w:t>
+      </w:r>
+      <w:proofErr w:type="spellStart"/>
+      <w:r>
+        <w:rPr>
+          <w:lang w:val="es-CO"/>
+        </w:rPr>
+        <w:t>Admin</w:t>
+      </w:r>
+      <w:proofErr w:type="spellEnd"/>
+      <w:r>
+        <w:rPr>
+          <w:lang w:val="es-CO"/>
+        </w:rPr>
+        <w:t>)</w:t>
       </w:r>
       <w:bookmarkEnd w:id="26"/>
     </w:p>
@@ -28821,7 +29882,7 @@
           <w:noProof/>
         </w:rPr>
         <w:drawing>
-          <wp:inline distT="0" distB="0" distL="0" distR="0" wp14:anchorId="77DA42E5" wp14:editId="382FF9CD">
+          <wp:inline distT="0" distB="0" distL="0" distR="0" wp14:anchorId="77DA42E5" wp14:editId="0E4C8A28">
             <wp:extent cx="5608994" cy="3101008"/>
             <wp:effectExtent l="0" t="0" r="0" b="4445"/>
             <wp:docPr id="713994819" name="Imagen 29" descr="Click on Gestión de Usuarios…"/>
@@ -28980,8 +30041,21 @@
           <w:szCs w:val="24"/>
           <w:lang w:val="es-CO"/>
         </w:rPr>
-        <w:t>Directorio de admins</w:t>
-      </w:r>
+        <w:t xml:space="preserve">Directorio de </w:t>
+      </w:r>
+      <w:proofErr w:type="spellStart"/>
+      <w:r>
+        <w:rPr>
+          <w:rFonts w:ascii="Comic Sans MS" w:hAnsi="Comic Sans MS"/>
+          <w:b/>
+          <w:bCs/>
+          <w:sz w:val="24"/>
+          <w:szCs w:val="24"/>
+          <w:lang w:val="es-CO"/>
+        </w:rPr>
+        <w:t>admins</w:t>
+      </w:r>
+      <w:proofErr w:type="spellEnd"/>
       <w:r>
         <w:rPr>
           <w:rFonts w:ascii="Comic Sans MS" w:hAnsi="Comic Sans MS"/>
@@ -29305,7 +30379,47 @@
           <w:szCs w:val="24"/>
           <w:lang w:val="es-CO"/>
         </w:rPr>
-        <w:t>: Desde el panel admin, seleccionar "Usuarios Admin"</w:t>
+        <w:t xml:space="preserve">: Desde el panel </w:t>
+      </w:r>
+      <w:proofErr w:type="spellStart"/>
+      <w:r>
+        <w:rPr>
+          <w:rFonts w:ascii="Comic Sans MS" w:hAnsi="Comic Sans MS"/>
+          <w:sz w:val="24"/>
+          <w:szCs w:val="24"/>
+          <w:lang w:val="es-CO"/>
+        </w:rPr>
+        <w:t>admin</w:t>
+      </w:r>
+      <w:proofErr w:type="spellEnd"/>
+      <w:r>
+        <w:rPr>
+          <w:rFonts w:ascii="Comic Sans MS" w:hAnsi="Comic Sans MS"/>
+          <w:sz w:val="24"/>
+          <w:szCs w:val="24"/>
+          <w:lang w:val="es-CO"/>
+        </w:rPr>
+        <w:t xml:space="preserve">, seleccionar "Usuarios </w:t>
+      </w:r>
+      <w:proofErr w:type="spellStart"/>
+      <w:r>
+        <w:rPr>
+          <w:rFonts w:ascii="Comic Sans MS" w:hAnsi="Comic Sans MS"/>
+          <w:sz w:val="24"/>
+          <w:szCs w:val="24"/>
+          <w:lang w:val="es-CO"/>
+        </w:rPr>
+        <w:t>Admin</w:t>
+      </w:r>
+      <w:proofErr w:type="spellEnd"/>
+      <w:r>
+        <w:rPr>
+          <w:rFonts w:ascii="Comic Sans MS" w:hAnsi="Comic Sans MS"/>
+          <w:sz w:val="24"/>
+          <w:szCs w:val="24"/>
+          <w:lang w:val="es-CO"/>
+        </w:rPr>
+        <w:t>"</w:t>
       </w:r>
     </w:p>
     <w:p>
@@ -29340,8 +30454,19 @@
           <w:szCs w:val="24"/>
           <w:lang w:val="es-CO"/>
         </w:rPr>
-        <w:t>: La pantalla muestra todos los usuarios con acceso admin</w:t>
-      </w:r>
+        <w:t xml:space="preserve">: La pantalla muestra todos los usuarios con acceso </w:t>
+      </w:r>
+      <w:proofErr w:type="spellStart"/>
+      <w:r>
+        <w:rPr>
+          <w:rFonts w:ascii="Comic Sans MS" w:hAnsi="Comic Sans MS"/>
+          <w:sz w:val="24"/>
+          <w:szCs w:val="24"/>
+          <w:lang w:val="es-CO"/>
+        </w:rPr>
+        <w:t>admin</w:t>
+      </w:r>
+      <w:proofErr w:type="spellEnd"/>
     </w:p>
     <w:p>
       <w:pPr>
@@ -30024,7 +31149,7 @@
           <w:noProof/>
         </w:rPr>
         <w:drawing>
-          <wp:inline distT="0" distB="0" distL="0" distR="0" wp14:anchorId="60E621EB" wp14:editId="1B92AC76">
+          <wp:inline distT="0" distB="0" distL="0" distR="0" wp14:anchorId="60E621EB" wp14:editId="74CA41D5">
             <wp:extent cx="5612130" cy="3689350"/>
             <wp:effectExtent l="0" t="0" r="7620" b="6350"/>
             <wp:docPr id="28866895" name="Imagen 30" descr="Click on Centro de Ayuda…"/>
@@ -30344,8 +31469,19 @@
           <w:szCs w:val="24"/>
           <w:lang w:val="es-CO"/>
         </w:rPr>
-        <w:t>: Referencias técnicas y APIs</w:t>
-      </w:r>
+        <w:t xml:space="preserve">: Referencias técnicas y </w:t>
+      </w:r>
+      <w:proofErr w:type="spellStart"/>
+      <w:r>
+        <w:rPr>
+          <w:rFonts w:ascii="Comic Sans MS" w:hAnsi="Comic Sans MS"/>
+          <w:sz w:val="24"/>
+          <w:szCs w:val="24"/>
+          <w:lang w:val="es-CO"/>
+        </w:rPr>
+        <w:t>APIs</w:t>
+      </w:r>
+      <w:proofErr w:type="spellEnd"/>
     </w:p>
     <w:p>
       <w:pPr>
@@ -30521,7 +31657,27 @@
           <w:szCs w:val="24"/>
           <w:lang w:val="es-CO"/>
         </w:rPr>
-        <w:t>: Desde el panel admin, seleccionar "Centro de Ayuda"</w:t>
+        <w:t xml:space="preserve">: Desde el panel </w:t>
+      </w:r>
+      <w:proofErr w:type="spellStart"/>
+      <w:r>
+        <w:rPr>
+          <w:rFonts w:ascii="Comic Sans MS" w:hAnsi="Comic Sans MS"/>
+          <w:sz w:val="24"/>
+          <w:szCs w:val="24"/>
+          <w:lang w:val="es-CO"/>
+        </w:rPr>
+        <w:t>admin</w:t>
+      </w:r>
+      <w:proofErr w:type="spellEnd"/>
+      <w:r>
+        <w:rPr>
+          <w:rFonts w:ascii="Comic Sans MS" w:hAnsi="Comic Sans MS"/>
+          <w:sz w:val="24"/>
+          <w:szCs w:val="24"/>
+          <w:lang w:val="es-CO"/>
+        </w:rPr>
+        <w:t>, seleccionar "Centro de Ayuda"</w:t>
       </w:r>
     </w:p>
     <w:p>
@@ -31176,7 +32332,27 @@
           <w:szCs w:val="24"/>
           <w:lang w:val="es-CO"/>
         </w:rPr>
-        <w:t>Participar en webinars y capacitaciones</w:t>
+        <w:t xml:space="preserve">Participar en </w:t>
+      </w:r>
+      <w:proofErr w:type="spellStart"/>
+      <w:r>
+        <w:rPr>
+          <w:rFonts w:ascii="Comic Sans MS" w:hAnsi="Comic Sans MS"/>
+          <w:sz w:val="24"/>
+          <w:szCs w:val="24"/>
+          <w:lang w:val="es-CO"/>
+        </w:rPr>
+        <w:t>webinars</w:t>
+      </w:r>
+      <w:proofErr w:type="spellEnd"/>
+      <w:r>
+        <w:rPr>
+          <w:rFonts w:ascii="Comic Sans MS" w:hAnsi="Comic Sans MS"/>
+          <w:sz w:val="24"/>
+          <w:szCs w:val="24"/>
+          <w:lang w:val="es-CO"/>
+        </w:rPr>
+        <w:t xml:space="preserve"> y capacitaciones</w:t>
       </w:r>
     </w:p>
     <w:p>
@@ -37293,6 +38469,155 @@
     </w:lvl>
   </w:abstractNum>
   <w:abstractNum w:abstractNumId="41" w15:restartNumberingAfterBreak="0">
+    <w:nsid w:val="48977C75"/>
+    <w:multiLevelType w:val="multilevel"/>
+    <w:tmpl w:val="D10EB2A2"/>
+    <w:lvl w:ilvl="0">
+      <w:start w:val="1"/>
+      <w:numFmt w:val="bullet"/>
+      <w:lvlText w:val=""/>
+      <w:lvlJc w:val="left"/>
+      <w:pPr>
+        <w:tabs>
+          <w:tab w:val="num" w:pos="720"/>
+        </w:tabs>
+        <w:ind w:left="720" w:hanging="360"/>
+      </w:pPr>
+      <w:rPr>
+        <w:rFonts w:ascii="Symbol" w:hAnsi="Symbol" w:hint="default"/>
+        <w:sz w:val="20"/>
+      </w:rPr>
+    </w:lvl>
+    <w:lvl w:ilvl="1" w:tentative="1">
+      <w:start w:val="1"/>
+      <w:numFmt w:val="bullet"/>
+      <w:lvlText w:val="o"/>
+      <w:lvlJc w:val="left"/>
+      <w:pPr>
+        <w:tabs>
+          <w:tab w:val="num" w:pos="1440"/>
+        </w:tabs>
+        <w:ind w:left="1440" w:hanging="360"/>
+      </w:pPr>
+      <w:rPr>
+        <w:rFonts w:ascii="Courier New" w:hAnsi="Courier New" w:hint="default"/>
+        <w:sz w:val="20"/>
+      </w:rPr>
+    </w:lvl>
+    <w:lvl w:ilvl="2" w:tentative="1">
+      <w:start w:val="1"/>
+      <w:numFmt w:val="bullet"/>
+      <w:lvlText w:val=""/>
+      <w:lvlJc w:val="left"/>
+      <w:pPr>
+        <w:tabs>
+          <w:tab w:val="num" w:pos="2160"/>
+        </w:tabs>
+        <w:ind w:left="2160" w:hanging="360"/>
+      </w:pPr>
+      <w:rPr>
+        <w:rFonts w:ascii="Wingdings" w:hAnsi="Wingdings" w:hint="default"/>
+        <w:sz w:val="20"/>
+      </w:rPr>
+    </w:lvl>
+    <w:lvl w:ilvl="3" w:tentative="1">
+      <w:start w:val="1"/>
+      <w:numFmt w:val="bullet"/>
+      <w:lvlText w:val=""/>
+      <w:lvlJc w:val="left"/>
+      <w:pPr>
+        <w:tabs>
+          <w:tab w:val="num" w:pos="2880"/>
+        </w:tabs>
+        <w:ind w:left="2880" w:hanging="360"/>
+      </w:pPr>
+      <w:rPr>
+        <w:rFonts w:ascii="Wingdings" w:hAnsi="Wingdings" w:hint="default"/>
+        <w:sz w:val="20"/>
+      </w:rPr>
+    </w:lvl>
+    <w:lvl w:ilvl="4" w:tentative="1">
+      <w:start w:val="1"/>
+      <w:numFmt w:val="bullet"/>
+      <w:lvlText w:val=""/>
+      <w:lvlJc w:val="left"/>
+      <w:pPr>
+        <w:tabs>
+          <w:tab w:val="num" w:pos="3600"/>
+        </w:tabs>
+        <w:ind w:left="3600" w:hanging="360"/>
+      </w:pPr>
+      <w:rPr>
+        <w:rFonts w:ascii="Wingdings" w:hAnsi="Wingdings" w:hint="default"/>
+        <w:sz w:val="20"/>
+      </w:rPr>
+    </w:lvl>
+    <w:lvl w:ilvl="5" w:tentative="1">
+      <w:start w:val="1"/>
+      <w:numFmt w:val="bullet"/>
+      <w:lvlText w:val=""/>
+      <w:lvlJc w:val="left"/>
+      <w:pPr>
+        <w:tabs>
+          <w:tab w:val="num" w:pos="4320"/>
+        </w:tabs>
+        <w:ind w:left="4320" w:hanging="360"/>
+      </w:pPr>
+      <w:rPr>
+        <w:rFonts w:ascii="Wingdings" w:hAnsi="Wingdings" w:hint="default"/>
+        <w:sz w:val="20"/>
+      </w:rPr>
+    </w:lvl>
+    <w:lvl w:ilvl="6" w:tentative="1">
+      <w:start w:val="1"/>
+      <w:numFmt w:val="bullet"/>
+      <w:lvlText w:val=""/>
+      <w:lvlJc w:val="left"/>
+      <w:pPr>
+        <w:tabs>
+          <w:tab w:val="num" w:pos="5040"/>
+        </w:tabs>
+        <w:ind w:left="5040" w:hanging="360"/>
+      </w:pPr>
+      <w:rPr>
+        <w:rFonts w:ascii="Wingdings" w:hAnsi="Wingdings" w:hint="default"/>
+        <w:sz w:val="20"/>
+      </w:rPr>
+    </w:lvl>
+    <w:lvl w:ilvl="7" w:tentative="1">
+      <w:start w:val="1"/>
+      <w:numFmt w:val="bullet"/>
+      <w:lvlText w:val=""/>
+      <w:lvlJc w:val="left"/>
+      <w:pPr>
+        <w:tabs>
+          <w:tab w:val="num" w:pos="5760"/>
+        </w:tabs>
+        <w:ind w:left="5760" w:hanging="360"/>
+      </w:pPr>
+      <w:rPr>
+        <w:rFonts w:ascii="Wingdings" w:hAnsi="Wingdings" w:hint="default"/>
+        <w:sz w:val="20"/>
+      </w:rPr>
+    </w:lvl>
+    <w:lvl w:ilvl="8" w:tentative="1">
+      <w:start w:val="1"/>
+      <w:numFmt w:val="bullet"/>
+      <w:lvlText w:val=""/>
+      <w:lvlJc w:val="left"/>
+      <w:pPr>
+        <w:tabs>
+          <w:tab w:val="num" w:pos="6480"/>
+        </w:tabs>
+        <w:ind w:left="6480" w:hanging="360"/>
+      </w:pPr>
+      <w:rPr>
+        <w:rFonts w:ascii="Wingdings" w:hAnsi="Wingdings" w:hint="default"/>
+        <w:sz w:val="20"/>
+      </w:rPr>
+    </w:lvl>
+  </w:abstractNum>
+  <w:abstractNum w:abstractNumId="42" w15:restartNumberingAfterBreak="0">
     <w:nsid w:val="50225CC6"/>
     <w:multiLevelType w:val="multilevel"/>
     <w:tmpl w:val="A8C62520"/>
@@ -37409,7 +38734,7 @@
       </w:pPr>
     </w:lvl>
   </w:abstractNum>
-  <w:abstractNum w:abstractNumId="42" w15:restartNumberingAfterBreak="0">
+  <w:abstractNum w:abstractNumId="43" w15:restartNumberingAfterBreak="0">
     <w:nsid w:val="55FE3D2B"/>
     <w:multiLevelType w:val="multilevel"/>
     <w:tmpl w:val="92EC1110"/>
@@ -37558,7 +38883,7 @@
       </w:rPr>
     </w:lvl>
   </w:abstractNum>
-  <w:abstractNum w:abstractNumId="43" w15:restartNumberingAfterBreak="0">
+  <w:abstractNum w:abstractNumId="44" w15:restartNumberingAfterBreak="0">
     <w:nsid w:val="56135972"/>
     <w:multiLevelType w:val="multilevel"/>
     <w:tmpl w:val="81E22118"/>
@@ -37707,7 +39032,7 @@
       </w:rPr>
     </w:lvl>
   </w:abstractNum>
-  <w:abstractNum w:abstractNumId="44" w15:restartNumberingAfterBreak="0">
+  <w:abstractNum w:abstractNumId="45" w15:restartNumberingAfterBreak="0">
     <w:nsid w:val="5795361C"/>
     <w:multiLevelType w:val="multilevel"/>
     <w:tmpl w:val="03229A52"/>
@@ -37824,7 +39149,156 @@
       </w:pPr>
     </w:lvl>
   </w:abstractNum>
-  <w:abstractNum w:abstractNumId="45" w15:restartNumberingAfterBreak="0">
+  <w:abstractNum w:abstractNumId="46" w15:restartNumberingAfterBreak="0">
+    <w:nsid w:val="5A2A56E6"/>
+    <w:multiLevelType w:val="multilevel"/>
+    <w:tmpl w:val="FEA0FD80"/>
+    <w:lvl w:ilvl="0">
+      <w:start w:val="1"/>
+      <w:numFmt w:val="bullet"/>
+      <w:lvlText w:val=""/>
+      <w:lvlJc w:val="left"/>
+      <w:pPr>
+        <w:tabs>
+          <w:tab w:val="num" w:pos="720"/>
+        </w:tabs>
+        <w:ind w:left="720" w:hanging="360"/>
+      </w:pPr>
+      <w:rPr>
+        <w:rFonts w:ascii="Symbol" w:hAnsi="Symbol" w:hint="default"/>
+        <w:sz w:val="20"/>
+      </w:rPr>
+    </w:lvl>
+    <w:lvl w:ilvl="1" w:tentative="1">
+      <w:start w:val="1"/>
+      <w:numFmt w:val="bullet"/>
+      <w:lvlText w:val="o"/>
+      <w:lvlJc w:val="left"/>
+      <w:pPr>
+        <w:tabs>
+          <w:tab w:val="num" w:pos="1440"/>
+        </w:tabs>
+        <w:ind w:left="1440" w:hanging="360"/>
+      </w:pPr>
+      <w:rPr>
+        <w:rFonts w:ascii="Courier New" w:hAnsi="Courier New" w:hint="default"/>
+        <w:sz w:val="20"/>
+      </w:rPr>
+    </w:lvl>
+    <w:lvl w:ilvl="2" w:tentative="1">
+      <w:start w:val="1"/>
+      <w:numFmt w:val="bullet"/>
+      <w:lvlText w:val=""/>
+      <w:lvlJc w:val="left"/>
+      <w:pPr>
+        <w:tabs>
+          <w:tab w:val="num" w:pos="2160"/>
+        </w:tabs>
+        <w:ind w:left="2160" w:hanging="360"/>
+      </w:pPr>
+      <w:rPr>
+        <w:rFonts w:ascii="Wingdings" w:hAnsi="Wingdings" w:hint="default"/>
+        <w:sz w:val="20"/>
+      </w:rPr>
+    </w:lvl>
+    <w:lvl w:ilvl="3" w:tentative="1">
+      <w:start w:val="1"/>
+      <w:numFmt w:val="bullet"/>
+      <w:lvlText w:val=""/>
+      <w:lvlJc w:val="left"/>
+      <w:pPr>
+        <w:tabs>
+          <w:tab w:val="num" w:pos="2880"/>
+        </w:tabs>
+        <w:ind w:left="2880" w:hanging="360"/>
+      </w:pPr>
+      <w:rPr>
+        <w:rFonts w:ascii="Wingdings" w:hAnsi="Wingdings" w:hint="default"/>
+        <w:sz w:val="20"/>
+      </w:rPr>
+    </w:lvl>
+    <w:lvl w:ilvl="4" w:tentative="1">
+      <w:start w:val="1"/>
+      <w:numFmt w:val="bullet"/>
+      <w:lvlText w:val=""/>
+      <w:lvlJc w:val="left"/>
+      <w:pPr>
+        <w:tabs>
+          <w:tab w:val="num" w:pos="3600"/>
+        </w:tabs>
+        <w:ind w:left="3600" w:hanging="360"/>
+      </w:pPr>
+      <w:rPr>
+        <w:rFonts w:ascii="Wingdings" w:hAnsi="Wingdings" w:hint="default"/>
+        <w:sz w:val="20"/>
+      </w:rPr>
+    </w:lvl>
+    <w:lvl w:ilvl="5" w:tentative="1">
+      <w:start w:val="1"/>
+      <w:numFmt w:val="bullet"/>
+      <w:lvlText w:val=""/>
+      <w:lvlJc w:val="left"/>
+      <w:pPr>
+        <w:tabs>
+          <w:tab w:val="num" w:pos="4320"/>
+        </w:tabs>
+        <w:ind w:left="4320" w:hanging="360"/>
+      </w:pPr>
+      <w:rPr>
+        <w:rFonts w:ascii="Wingdings" w:hAnsi="Wingdings" w:hint="default"/>
+        <w:sz w:val="20"/>
+      </w:rPr>
+    </w:lvl>
+    <w:lvl w:ilvl="6" w:tentative="1">
+      <w:start w:val="1"/>
+      <w:numFmt w:val="bullet"/>
+      <w:lvlText w:val=""/>
+      <w:lvlJc w:val="left"/>
+      <w:pPr>
+        <w:tabs>
+          <w:tab w:val="num" w:pos="5040"/>
+        </w:tabs>
+        <w:ind w:left="5040" w:hanging="360"/>
+      </w:pPr>
+      <w:rPr>
+        <w:rFonts w:ascii="Wingdings" w:hAnsi="Wingdings" w:hint="default"/>
+        <w:sz w:val="20"/>
+      </w:rPr>
+    </w:lvl>
+    <w:lvl w:ilvl="7" w:tentative="1">
+      <w:start w:val="1"/>
+      <w:numFmt w:val="bullet"/>
+      <w:lvlText w:val=""/>
+      <w:lvlJc w:val="left"/>
+      <w:pPr>
+        <w:tabs>
+          <w:tab w:val="num" w:pos="5760"/>
+        </w:tabs>
+        <w:ind w:left="5760" w:hanging="360"/>
+      </w:pPr>
+      <w:rPr>
+        <w:rFonts w:ascii="Wingdings" w:hAnsi="Wingdings" w:hint="default"/>
+        <w:sz w:val="20"/>
+      </w:rPr>
+    </w:lvl>
+    <w:lvl w:ilvl="8" w:tentative="1">
+      <w:start w:val="1"/>
+      <w:numFmt w:val="bullet"/>
+      <w:lvlText w:val=""/>
+      <w:lvlJc w:val="left"/>
+      <w:pPr>
+        <w:tabs>
+          <w:tab w:val="num" w:pos="6480"/>
+        </w:tabs>
+        <w:ind w:left="6480" w:hanging="360"/>
+      </w:pPr>
+      <w:rPr>
+        <w:rFonts w:ascii="Wingdings" w:hAnsi="Wingdings" w:hint="default"/>
+        <w:sz w:val="20"/>
+      </w:rPr>
+    </w:lvl>
+  </w:abstractNum>
+  <w:abstractNum w:abstractNumId="47" w15:restartNumberingAfterBreak="0">
     <w:nsid w:val="5F115322"/>
     <w:multiLevelType w:val="multilevel"/>
     <w:tmpl w:val="F84C0F6C"/>
@@ -37941,7 +39415,156 @@
       </w:pPr>
     </w:lvl>
   </w:abstractNum>
-  <w:abstractNum w:abstractNumId="46" w15:restartNumberingAfterBreak="0">
+  <w:abstractNum w:abstractNumId="48" w15:restartNumberingAfterBreak="0">
+    <w:nsid w:val="615C47E6"/>
+    <w:multiLevelType w:val="multilevel"/>
+    <w:tmpl w:val="18F24636"/>
+    <w:lvl w:ilvl="0">
+      <w:start w:val="1"/>
+      <w:numFmt w:val="bullet"/>
+      <w:lvlText w:val=""/>
+      <w:lvlJc w:val="left"/>
+      <w:pPr>
+        <w:tabs>
+          <w:tab w:val="num" w:pos="720"/>
+        </w:tabs>
+        <w:ind w:left="720" w:hanging="360"/>
+      </w:pPr>
+      <w:rPr>
+        <w:rFonts w:ascii="Symbol" w:hAnsi="Symbol" w:hint="default"/>
+        <w:sz w:val="20"/>
+      </w:rPr>
+    </w:lvl>
+    <w:lvl w:ilvl="1" w:tentative="1">
+      <w:start w:val="1"/>
+      <w:numFmt w:val="bullet"/>
+      <w:lvlText w:val="o"/>
+      <w:lvlJc w:val="left"/>
+      <w:pPr>
+        <w:tabs>
+          <w:tab w:val="num" w:pos="1440"/>
+        </w:tabs>
+        <w:ind w:left="1440" w:hanging="360"/>
+      </w:pPr>
+      <w:rPr>
+        <w:rFonts w:ascii="Courier New" w:hAnsi="Courier New" w:hint="default"/>
+        <w:sz w:val="20"/>
+      </w:rPr>
+    </w:lvl>
+    <w:lvl w:ilvl="2" w:tentative="1">
+      <w:start w:val="1"/>
+      <w:numFmt w:val="bullet"/>
+      <w:lvlText w:val=""/>
+      <w:lvlJc w:val="left"/>
+      <w:pPr>
+        <w:tabs>
+          <w:tab w:val="num" w:pos="2160"/>
+        </w:tabs>
+        <w:ind w:left="2160" w:hanging="360"/>
+      </w:pPr>
+      <w:rPr>
+        <w:rFonts w:ascii="Wingdings" w:hAnsi="Wingdings" w:hint="default"/>
+        <w:sz w:val="20"/>
+      </w:rPr>
+    </w:lvl>
+    <w:lvl w:ilvl="3" w:tentative="1">
+      <w:start w:val="1"/>
+      <w:numFmt w:val="bullet"/>
+      <w:lvlText w:val=""/>
+      <w:lvlJc w:val="left"/>
+      <w:pPr>
+        <w:tabs>
+          <w:tab w:val="num" w:pos="2880"/>
+        </w:tabs>
+        <w:ind w:left="2880" w:hanging="360"/>
+      </w:pPr>
+      <w:rPr>
+        <w:rFonts w:ascii="Wingdings" w:hAnsi="Wingdings" w:hint="default"/>
+        <w:sz w:val="20"/>
+      </w:rPr>
+    </w:lvl>
+    <w:lvl w:ilvl="4" w:tentative="1">
+      <w:start w:val="1"/>
+      <w:numFmt w:val="bullet"/>
+      <w:lvlText w:val=""/>
+      <w:lvlJc w:val="left"/>
+      <w:pPr>
+        <w:tabs>
+          <w:tab w:val="num" w:pos="3600"/>
+        </w:tabs>
+        <w:ind w:left="3600" w:hanging="360"/>
+      </w:pPr>
+      <w:rPr>
+        <w:rFonts w:ascii="Wingdings" w:hAnsi="Wingdings" w:hint="default"/>
+        <w:sz w:val="20"/>
+      </w:rPr>
+    </w:lvl>
+    <w:lvl w:ilvl="5" w:tentative="1">
+      <w:start w:val="1"/>
+      <w:numFmt w:val="bullet"/>
+      <w:lvlText w:val=""/>
+      <w:lvlJc w:val="left"/>
+      <w:pPr>
+        <w:tabs>
+          <w:tab w:val="num" w:pos="4320"/>
+        </w:tabs>
+        <w:ind w:left="4320" w:hanging="360"/>
+      </w:pPr>
+      <w:rPr>
+        <w:rFonts w:ascii="Wingdings" w:hAnsi="Wingdings" w:hint="default"/>
+        <w:sz w:val="20"/>
+      </w:rPr>
+    </w:lvl>
+    <w:lvl w:ilvl="6" w:tentative="1">
+      <w:start w:val="1"/>
+      <w:numFmt w:val="bullet"/>
+      <w:lvlText w:val=""/>
+      <w:lvlJc w:val="left"/>
+      <w:pPr>
+        <w:tabs>
+          <w:tab w:val="num" w:pos="5040"/>
+        </w:tabs>
+        <w:ind w:left="5040" w:hanging="360"/>
+      </w:pPr>
+      <w:rPr>
+        <w:rFonts w:ascii="Wingdings" w:hAnsi="Wingdings" w:hint="default"/>
+        <w:sz w:val="20"/>
+      </w:rPr>
+    </w:lvl>
+    <w:lvl w:ilvl="7" w:tentative="1">
+      <w:start w:val="1"/>
+      <w:numFmt w:val="bullet"/>
+      <w:lvlText w:val=""/>
+      <w:lvlJc w:val="left"/>
+      <w:pPr>
+        <w:tabs>
+          <w:tab w:val="num" w:pos="5760"/>
+        </w:tabs>
+        <w:ind w:left="5760" w:hanging="360"/>
+      </w:pPr>
+      <w:rPr>
+        <w:rFonts w:ascii="Wingdings" w:hAnsi="Wingdings" w:hint="default"/>
+        <w:sz w:val="20"/>
+      </w:rPr>
+    </w:lvl>
+    <w:lvl w:ilvl="8" w:tentative="1">
+      <w:start w:val="1"/>
+      <w:numFmt w:val="bullet"/>
+      <w:lvlText w:val=""/>
+      <w:lvlJc w:val="left"/>
+      <w:pPr>
+        <w:tabs>
+          <w:tab w:val="num" w:pos="6480"/>
+        </w:tabs>
+        <w:ind w:left="6480" w:hanging="360"/>
+      </w:pPr>
+      <w:rPr>
+        <w:rFonts w:ascii="Wingdings" w:hAnsi="Wingdings" w:hint="default"/>
+        <w:sz w:val="20"/>
+      </w:rPr>
+    </w:lvl>
+  </w:abstractNum>
+  <w:abstractNum w:abstractNumId="49" w15:restartNumberingAfterBreak="0">
     <w:nsid w:val="621503A1"/>
     <w:multiLevelType w:val="multilevel"/>
     <w:tmpl w:val="E30E24E8"/>
@@ -38058,7 +39681,7 @@
       </w:pPr>
     </w:lvl>
   </w:abstractNum>
-  <w:abstractNum w:abstractNumId="47" w15:restartNumberingAfterBreak="0">
+  <w:abstractNum w:abstractNumId="50" w15:restartNumberingAfterBreak="0">
     <w:nsid w:val="6224533F"/>
     <w:multiLevelType w:val="multilevel"/>
     <w:tmpl w:val="AD785750"/>
@@ -38175,7 +39798,7 @@
       </w:pPr>
     </w:lvl>
   </w:abstractNum>
-  <w:abstractNum w:abstractNumId="48" w15:restartNumberingAfterBreak="0">
+  <w:abstractNum w:abstractNumId="51" w15:restartNumberingAfterBreak="0">
     <w:nsid w:val="63254A3D"/>
     <w:multiLevelType w:val="multilevel"/>
     <w:tmpl w:val="B2222E0A"/>
@@ -38292,10 +39915,10 @@
       </w:pPr>
     </w:lvl>
   </w:abstractNum>
-  <w:abstractNum w:abstractNumId="49" w15:restartNumberingAfterBreak="0">
+  <w:abstractNum w:abstractNumId="52" w15:restartNumberingAfterBreak="0">
     <w:nsid w:val="63A906BC"/>
     <w:multiLevelType w:val="hybridMultilevel"/>
-    <w:tmpl w:val="7032892C"/>
+    <w:tmpl w:val="DC763180"/>
     <w:lvl w:ilvl="0" w:tplc="240A000B">
       <w:start w:val="1"/>
       <w:numFmt w:val="bullet"/>
@@ -38405,7 +40028,7 @@
       </w:rPr>
     </w:lvl>
   </w:abstractNum>
-  <w:abstractNum w:abstractNumId="50" w15:restartNumberingAfterBreak="0">
+  <w:abstractNum w:abstractNumId="53" w15:restartNumberingAfterBreak="0">
     <w:nsid w:val="66454366"/>
     <w:multiLevelType w:val="multilevel"/>
     <w:tmpl w:val="B9DA5382"/>
@@ -38554,7 +40177,7 @@
       </w:rPr>
     </w:lvl>
   </w:abstractNum>
-  <w:abstractNum w:abstractNumId="51" w15:restartNumberingAfterBreak="0">
+  <w:abstractNum w:abstractNumId="54" w15:restartNumberingAfterBreak="0">
     <w:nsid w:val="67EF04A6"/>
     <w:multiLevelType w:val="multilevel"/>
     <w:tmpl w:val="F4D66A92"/>
@@ -38671,7 +40294,7 @@
       </w:pPr>
     </w:lvl>
   </w:abstractNum>
-  <w:abstractNum w:abstractNumId="52" w15:restartNumberingAfterBreak="0">
+  <w:abstractNum w:abstractNumId="55" w15:restartNumberingAfterBreak="0">
     <w:nsid w:val="6C5F4E95"/>
     <w:multiLevelType w:val="multilevel"/>
     <w:tmpl w:val="DA30DD00"/>
@@ -38788,7 +40411,7 @@
       </w:pPr>
     </w:lvl>
   </w:abstractNum>
-  <w:abstractNum w:abstractNumId="53" w15:restartNumberingAfterBreak="0">
+  <w:abstractNum w:abstractNumId="56" w15:restartNumberingAfterBreak="0">
     <w:nsid w:val="6CC05DD9"/>
     <w:multiLevelType w:val="multilevel"/>
     <w:tmpl w:val="55EA4DD4"/>
@@ -38937,7 +40560,7 @@
       </w:rPr>
     </w:lvl>
   </w:abstractNum>
-  <w:abstractNum w:abstractNumId="54" w15:restartNumberingAfterBreak="0">
+  <w:abstractNum w:abstractNumId="57" w15:restartNumberingAfterBreak="0">
     <w:nsid w:val="6D0B0E28"/>
     <w:multiLevelType w:val="multilevel"/>
     <w:tmpl w:val="AEFEC972"/>
@@ -39054,7 +40677,7 @@
       </w:pPr>
     </w:lvl>
   </w:abstractNum>
-  <w:abstractNum w:abstractNumId="55" w15:restartNumberingAfterBreak="0">
+  <w:abstractNum w:abstractNumId="58" w15:restartNumberingAfterBreak="0">
     <w:nsid w:val="6DA35C32"/>
     <w:multiLevelType w:val="multilevel"/>
     <w:tmpl w:val="573896E6"/>
@@ -39203,7 +40826,7 @@
       </w:rPr>
     </w:lvl>
   </w:abstractNum>
-  <w:abstractNum w:abstractNumId="56" w15:restartNumberingAfterBreak="0">
+  <w:abstractNum w:abstractNumId="59" w15:restartNumberingAfterBreak="0">
     <w:nsid w:val="7656227D"/>
     <w:multiLevelType w:val="multilevel"/>
     <w:tmpl w:val="B1AEDC2A"/>
@@ -39320,7 +40943,7 @@
       </w:pPr>
     </w:lvl>
   </w:abstractNum>
-  <w:abstractNum w:abstractNumId="57" w15:restartNumberingAfterBreak="0">
+  <w:abstractNum w:abstractNumId="60" w15:restartNumberingAfterBreak="0">
     <w:nsid w:val="77AC4BD8"/>
     <w:multiLevelType w:val="multilevel"/>
     <w:tmpl w:val="E9EE1496"/>
@@ -39469,7 +41092,7 @@
       </w:rPr>
     </w:lvl>
   </w:abstractNum>
-  <w:abstractNum w:abstractNumId="58" w15:restartNumberingAfterBreak="0">
+  <w:abstractNum w:abstractNumId="61" w15:restartNumberingAfterBreak="0">
     <w:nsid w:val="77D873E2"/>
     <w:multiLevelType w:val="multilevel"/>
     <w:tmpl w:val="013CC7EE"/>
@@ -39618,7 +41241,7 @@
       </w:rPr>
     </w:lvl>
   </w:abstractNum>
-  <w:abstractNum w:abstractNumId="59" w15:restartNumberingAfterBreak="0">
+  <w:abstractNum w:abstractNumId="62" w15:restartNumberingAfterBreak="0">
     <w:nsid w:val="7AF55495"/>
     <w:multiLevelType w:val="multilevel"/>
     <w:tmpl w:val="1DFE04D0"/>
@@ -39767,7 +41390,7 @@
       </w:rPr>
     </w:lvl>
   </w:abstractNum>
-  <w:abstractNum w:abstractNumId="60" w15:restartNumberingAfterBreak="0">
+  <w:abstractNum w:abstractNumId="63" w15:restartNumberingAfterBreak="0">
     <w:nsid w:val="7D6F6649"/>
     <w:multiLevelType w:val="multilevel"/>
     <w:tmpl w:val="8220718E"/>
@@ -39891,10 +41514,10 @@
     <w:abstractNumId w:val="0"/>
   </w:num>
   <w:num w:numId="3" w16cid:durableId="125633027">
-    <w:abstractNumId w:val="57"/>
+    <w:abstractNumId w:val="60"/>
   </w:num>
   <w:num w:numId="4" w16cid:durableId="1421214624">
-    <w:abstractNumId w:val="54"/>
+    <w:abstractNumId w:val="57"/>
   </w:num>
   <w:num w:numId="5" w16cid:durableId="921378010">
     <w:abstractNumId w:val="37"/>
@@ -39906,7 +41529,7 @@
     <w:abstractNumId w:val="28"/>
   </w:num>
   <w:num w:numId="8" w16cid:durableId="1161386754">
-    <w:abstractNumId w:val="48"/>
+    <w:abstractNumId w:val="51"/>
   </w:num>
   <w:num w:numId="9" w16cid:durableId="1718816598">
     <w:abstractNumId w:val="10"/>
@@ -39942,7 +41565,7 @@
     <w:abstractNumId w:val="2"/>
   </w:num>
   <w:num w:numId="20" w16cid:durableId="1907957635">
-    <w:abstractNumId w:val="44"/>
+    <w:abstractNumId w:val="45"/>
   </w:num>
   <w:num w:numId="21" w16cid:durableId="597297376">
     <w:abstractNumId w:val="22"/>
@@ -39957,7 +41580,7 @@
     <w:abstractNumId w:val="4"/>
   </w:num>
   <w:num w:numId="25" w16cid:durableId="1855419761">
-    <w:abstractNumId w:val="59"/>
+    <w:abstractNumId w:val="62"/>
   </w:num>
   <w:num w:numId="26" w16cid:durableId="600456793">
     <w:abstractNumId w:val="34"/>
@@ -39966,7 +41589,7 @@
     <w:abstractNumId w:val="24"/>
   </w:num>
   <w:num w:numId="28" w16cid:durableId="707099053">
-    <w:abstractNumId w:val="46"/>
+    <w:abstractNumId w:val="49"/>
   </w:num>
   <w:num w:numId="29" w16cid:durableId="2094164381">
     <w:abstractNumId w:val="23"/>
@@ -39978,7 +41601,7 @@
     <w:abstractNumId w:val="35"/>
   </w:num>
   <w:num w:numId="32" w16cid:durableId="1088884683">
-    <w:abstractNumId w:val="41"/>
+    <w:abstractNumId w:val="42"/>
   </w:num>
   <w:num w:numId="33" w16cid:durableId="1777367913">
     <w:abstractNumId w:val="12"/>
@@ -39990,13 +41613,13 @@
     <w:abstractNumId w:val="32"/>
   </w:num>
   <w:num w:numId="36" w16cid:durableId="1675373017">
-    <w:abstractNumId w:val="56"/>
+    <w:abstractNumId w:val="59"/>
   </w:num>
   <w:num w:numId="37" w16cid:durableId="316419310">
     <w:abstractNumId w:val="21"/>
   </w:num>
   <w:num w:numId="38" w16cid:durableId="2004241017">
-    <w:abstractNumId w:val="51"/>
+    <w:abstractNumId w:val="54"/>
   </w:num>
   <w:num w:numId="39" w16cid:durableId="1617828058">
     <w:abstractNumId w:val="40"/>
@@ -40008,31 +41631,31 @@
     <w:abstractNumId w:val="14"/>
   </w:num>
   <w:num w:numId="42" w16cid:durableId="221136065">
-    <w:abstractNumId w:val="47"/>
+    <w:abstractNumId w:val="50"/>
   </w:num>
   <w:num w:numId="43" w16cid:durableId="921333214">
-    <w:abstractNumId w:val="55"/>
+    <w:abstractNumId w:val="58"/>
   </w:num>
   <w:num w:numId="44" w16cid:durableId="203371231">
     <w:abstractNumId w:val="31"/>
   </w:num>
   <w:num w:numId="45" w16cid:durableId="2131777738">
-    <w:abstractNumId w:val="43"/>
+    <w:abstractNumId w:val="44"/>
   </w:num>
   <w:num w:numId="46" w16cid:durableId="535047593">
     <w:abstractNumId w:val="5"/>
   </w:num>
   <w:num w:numId="47" w16cid:durableId="2099983846">
-    <w:abstractNumId w:val="50"/>
+    <w:abstractNumId w:val="53"/>
   </w:num>
   <w:num w:numId="48" w16cid:durableId="1542592682">
-    <w:abstractNumId w:val="60"/>
+    <w:abstractNumId w:val="63"/>
   </w:num>
   <w:num w:numId="49" w16cid:durableId="256594454">
-    <w:abstractNumId w:val="53"/>
+    <w:abstractNumId w:val="56"/>
   </w:num>
   <w:num w:numId="50" w16cid:durableId="1629320204">
-    <w:abstractNumId w:val="52"/>
+    <w:abstractNumId w:val="55"/>
   </w:num>
   <w:num w:numId="51" w16cid:durableId="1845626904">
     <w:abstractNumId w:val="29"/>
@@ -40044,28 +41667,37 @@
     <w:abstractNumId w:val="8"/>
   </w:num>
   <w:num w:numId="54" w16cid:durableId="314771113">
-    <w:abstractNumId w:val="45"/>
+    <w:abstractNumId w:val="47"/>
   </w:num>
   <w:num w:numId="55" w16cid:durableId="131555973">
     <w:abstractNumId w:val="33"/>
   </w:num>
   <w:num w:numId="56" w16cid:durableId="103235234">
-    <w:abstractNumId w:val="42"/>
+    <w:abstractNumId w:val="43"/>
   </w:num>
   <w:num w:numId="57" w16cid:durableId="314184174">
     <w:abstractNumId w:val="13"/>
   </w:num>
   <w:num w:numId="58" w16cid:durableId="1507288845">
-    <w:abstractNumId w:val="58"/>
+    <w:abstractNumId w:val="61"/>
   </w:num>
   <w:num w:numId="59" w16cid:durableId="1457916023">
-    <w:abstractNumId w:val="49"/>
+    <w:abstractNumId w:val="52"/>
   </w:num>
   <w:num w:numId="60" w16cid:durableId="1472743842">
     <w:abstractNumId w:val="7"/>
   </w:num>
   <w:num w:numId="61" w16cid:durableId="913276867">
     <w:abstractNumId w:val="20"/>
+  </w:num>
+  <w:num w:numId="62" w16cid:durableId="1837455846">
+    <w:abstractNumId w:val="46"/>
+  </w:num>
+  <w:num w:numId="63" w16cid:durableId="846090382">
+    <w:abstractNumId w:val="41"/>
+  </w:num>
+  <w:num w:numId="64" w16cid:durableId="178013465">
+    <w:abstractNumId w:val="48"/>
   </w:num>
   <w:numIdMacAtCleanup w:val="61"/>
 </w:numbering>

</xml_diff>